<commit_message>
Schematic update + docx for latex update
</commit_message>
<xml_diff>
--- a/MongoDB/MongoDB.docx
+++ b/MongoDB/MongoDB.docx
@@ -2,6 +2,100 @@
 <file path=word/document.xml><?xml version="1.0" encoding="utf-8"?>
 <w:document xmlns:wpc="http://schemas.microsoft.com/office/word/2010/wordprocessingCanvas" xmlns:cx="http://schemas.microsoft.com/office/drawing/2014/chartex" xmlns:cx1="http://schemas.microsoft.com/office/drawing/2015/9/8/chartex" xmlns:cx2="http://schemas.microsoft.com/office/drawing/2015/10/21/chartex" xmlns:cx3="http://schemas.microsoft.com/office/drawing/2016/5/9/chartex" xmlns:cx4="http://schemas.microsoft.com/office/drawing/2016/5/10/chartex" xmlns:cx5="http://schemas.microsoft.com/office/drawing/2016/5/11/chartex" xmlns:cx6="http://schemas.microsoft.com/office/drawing/2016/5/12/chartex" xmlns:cx7="http://schemas.microsoft.com/office/drawing/2016/5/13/chartex" xmlns:cx8="http://schemas.microsoft.com/office/drawing/2016/5/14/chartex" xmlns:mc="http://schemas.openxmlformats.org/markup-compatibility/2006" xmlns:aink="http://schemas.microsoft.com/office/drawing/2016/ink" xmlns:am3d="http://schemas.microsoft.com/office/drawing/2017/model3d" xmlns:o="urn:schemas-microsoft-com:office:office" xmlns:oel="http://schemas.microsoft.com/office/2019/extlst" xmlns:r="http://schemas.openxmlformats.org/officeDocument/2006/relationships" xmlns:m="http://schemas.openxmlformats.org/officeDocument/2006/math" xmlns:v="urn:schemas-microsoft-com:vml" xmlns:wp14="http://schemas.microsoft.com/office/word/2010/wordprocessingDrawing" xmlns:wp="http://schemas.openxmlformats.org/drawingml/2006/wordprocessingDrawing" xmlns:w10="urn:schemas-microsoft-com:office:word" xmlns:w="http://schemas.openxmlformats.org/wordprocessingml/2006/main" xmlns:w14="http://schemas.microsoft.com/office/word/2010/wordml" xmlns:w15="http://schemas.microsoft.com/office/word/2012/wordml" xmlns:w16cex="http://schemas.microsoft.com/office/word/2018/wordml/cex" xmlns:w16cid="http://schemas.microsoft.com/office/word/2016/wordml/cid" xmlns:w16="http://schemas.microsoft.com/office/word/2018/wordml" xmlns:w16sdtdh="http://schemas.microsoft.com/office/word/2020/wordml/sdtdatahash" xmlns:w16se="http://schemas.microsoft.com/office/word/2015/wordml/symex" xmlns:wpg="http://schemas.microsoft.com/office/word/2010/wordprocessingGroup" xmlns:wpi="http://schemas.microsoft.com/office/word/2010/wordprocessingInk" xmlns:wne="http://schemas.microsoft.com/office/word/2006/wordml" xmlns:wps="http://schemas.microsoft.com/office/word/2010/wordprocessingShape" mc:Ignorable="w14 w15 w16se w16cid w16 w16cex w16sdtdh wp14">
   <w:body>
+    <w:p>
+      <w:pPr>
+        <w:rPr>
+          <w:lang w:val="en-US"/>
+        </w:rPr>
+      </w:pPr>
+      <w:proofErr w:type="spellStart"/>
+      <w:r>
+        <w:rPr>
+          <w:lang w:val="en-US"/>
+        </w:rPr>
+        <w:t>Procedimento</w:t>
+      </w:r>
+      <w:proofErr w:type="spellEnd"/>
+      <w:r>
+        <w:rPr>
+          <w:lang w:val="en-US"/>
+        </w:rPr>
+        <w:t xml:space="preserve"> per il </w:t>
+      </w:r>
+      <w:proofErr w:type="spellStart"/>
+      <w:r>
+        <w:rPr>
+          <w:lang w:val="en-US"/>
+        </w:rPr>
+        <w:t>LateX</w:t>
+      </w:r>
+      <w:proofErr w:type="spellEnd"/>
+      <w:r>
+        <w:rPr>
+          <w:lang w:val="en-US"/>
+        </w:rPr>
+        <w:t>:</w:t>
+      </w:r>
+    </w:p>
+    <w:p>
+      <w:pPr>
+        <w:pStyle w:val="ListParagraph"/>
+        <w:numPr>
+          <w:ilvl w:val="0"/>
+          <w:numId w:val="2"/>
+        </w:numPr>
+      </w:pPr>
+      <w:r>
+        <w:t xml:space="preserve">Strutturato il DB con un grafico </w:t>
+      </w:r>
+      <w:r>
+        <w:t>a documenti</w:t>
+      </w:r>
+    </w:p>
+    <w:p>
+      <w:pPr>
+        <w:pStyle w:val="ListParagraph"/>
+        <w:numPr>
+          <w:ilvl w:val="0"/>
+          <w:numId w:val="2"/>
+        </w:numPr>
+      </w:pPr>
+      <w:r>
+        <w:t xml:space="preserve">Secondo il grafico abbiamo generato i dati con il tool online </w:t>
+      </w:r>
+      <w:proofErr w:type="spellStart"/>
+      <w:r>
+        <w:t>mockaroo</w:t>
+      </w:r>
+      <w:proofErr w:type="spellEnd"/>
+      <w:r>
+        <w:t xml:space="preserve"> (alcuni casuali, alcuni presi dal vecchio DB utilizzato per Neo4J)</w:t>
+      </w:r>
+    </w:p>
+    <w:p>
+      <w:pPr>
+        <w:pStyle w:val="ListParagraph"/>
+        <w:numPr>
+          <w:ilvl w:val="0"/>
+          <w:numId w:val="2"/>
+        </w:numPr>
+      </w:pPr>
+      <w:r>
+        <w:t xml:space="preserve">Utilizzando degli script in </w:t>
+      </w:r>
+      <w:proofErr w:type="spellStart"/>
+      <w:r>
+        <w:t>python</w:t>
+      </w:r>
+      <w:proofErr w:type="spellEnd"/>
+      <w:r>
+        <w:t xml:space="preserve"> abbiamo aggiustato alcuni errori di forma e utilizzato dei tag e dei testi non casuali.</w:t>
+      </w:r>
+    </w:p>
+    <w:p/>
+    <w:p/>
+    <w:p/>
+    <w:p/>
     <w:p>
       <w:pPr>
         <w:rPr>
@@ -154,6 +248,119 @@
 <file path=word/numbering.xml><?xml version="1.0" encoding="utf-8"?>
 <w:numbering xmlns:wpc="http://schemas.microsoft.com/office/word/2010/wordprocessingCanvas" xmlns:cx="http://schemas.microsoft.com/office/drawing/2014/chartex" xmlns:cx1="http://schemas.microsoft.com/office/drawing/2015/9/8/chartex" xmlns:cx2="http://schemas.microsoft.com/office/drawing/2015/10/21/chartex" xmlns:cx3="http://schemas.microsoft.com/office/drawing/2016/5/9/chartex" xmlns:cx4="http://schemas.microsoft.com/office/drawing/2016/5/10/chartex" xmlns:cx5="http://schemas.microsoft.com/office/drawing/2016/5/11/chartex" xmlns:cx6="http://schemas.microsoft.com/office/drawing/2016/5/12/chartex" xmlns:cx7="http://schemas.microsoft.com/office/drawing/2016/5/13/chartex" xmlns:cx8="http://schemas.microsoft.com/office/drawing/2016/5/14/chartex" xmlns:mc="http://schemas.openxmlformats.org/markup-compatibility/2006" xmlns:aink="http://schemas.microsoft.com/office/drawing/2016/ink" xmlns:am3d="http://schemas.microsoft.com/office/drawing/2017/model3d" xmlns:o="urn:schemas-microsoft-com:office:office" xmlns:oel="http://schemas.microsoft.com/office/2019/extlst" xmlns:r="http://schemas.openxmlformats.org/officeDocument/2006/relationships" xmlns:m="http://schemas.openxmlformats.org/officeDocument/2006/math" xmlns:v="urn:schemas-microsoft-com:vml" xmlns:wp14="http://schemas.microsoft.com/office/word/2010/wordprocessingDrawing" xmlns:wp="http://schemas.openxmlformats.org/drawingml/2006/wordprocessingDrawing" xmlns:w10="urn:schemas-microsoft-com:office:word" xmlns:w="http://schemas.openxmlformats.org/wordprocessingml/2006/main" xmlns:w14="http://schemas.microsoft.com/office/word/2010/wordml" xmlns:w15="http://schemas.microsoft.com/office/word/2012/wordml" xmlns:w16cex="http://schemas.microsoft.com/office/word/2018/wordml/cex" xmlns:w16cid="http://schemas.microsoft.com/office/word/2016/wordml/cid" xmlns:w16="http://schemas.microsoft.com/office/word/2018/wordml" xmlns:w16sdtdh="http://schemas.microsoft.com/office/word/2020/wordml/sdtdatahash" xmlns:w16se="http://schemas.microsoft.com/office/word/2015/wordml/symex" xmlns:wpg="http://schemas.microsoft.com/office/word/2010/wordprocessingGroup" xmlns:wpi="http://schemas.microsoft.com/office/word/2010/wordprocessingInk" xmlns:wne="http://schemas.microsoft.com/office/word/2006/wordml" xmlns:wps="http://schemas.microsoft.com/office/word/2010/wordprocessingShape" mc:Ignorable="w14 w15 w16se w16cid w16 w16cex w16sdtdh wp14">
   <w:abstractNum w:abstractNumId="0" w15:restartNumberingAfterBreak="0">
+    <w:nsid w:val="239C5230"/>
+    <w:multiLevelType w:val="hybridMultilevel"/>
+    <w:tmpl w:val="7CE4B3B8"/>
+    <w:lvl w:ilvl="0" w:tplc="08090001">
+      <w:start w:val="1"/>
+      <w:numFmt w:val="bullet"/>
+      <w:lvlText w:val=""/>
+      <w:lvlJc w:val="left"/>
+      <w:pPr>
+        <w:ind w:left="720" w:hanging="360"/>
+      </w:pPr>
+      <w:rPr>
+        <w:rFonts w:ascii="Symbol" w:hAnsi="Symbol" w:hint="default"/>
+      </w:rPr>
+    </w:lvl>
+    <w:lvl w:ilvl="1" w:tplc="08090003" w:tentative="1">
+      <w:start w:val="1"/>
+      <w:numFmt w:val="bullet"/>
+      <w:lvlText w:val="o"/>
+      <w:lvlJc w:val="left"/>
+      <w:pPr>
+        <w:ind w:left="1440" w:hanging="360"/>
+      </w:pPr>
+      <w:rPr>
+        <w:rFonts w:ascii="Courier New" w:hAnsi="Courier New" w:cs="Courier New" w:hint="default"/>
+      </w:rPr>
+    </w:lvl>
+    <w:lvl w:ilvl="2" w:tplc="08090005" w:tentative="1">
+      <w:start w:val="1"/>
+      <w:numFmt w:val="bullet"/>
+      <w:lvlText w:val=""/>
+      <w:lvlJc w:val="left"/>
+      <w:pPr>
+        <w:ind w:left="2160" w:hanging="360"/>
+      </w:pPr>
+      <w:rPr>
+        <w:rFonts w:ascii="Wingdings" w:hAnsi="Wingdings" w:hint="default"/>
+      </w:rPr>
+    </w:lvl>
+    <w:lvl w:ilvl="3" w:tplc="08090001" w:tentative="1">
+      <w:start w:val="1"/>
+      <w:numFmt w:val="bullet"/>
+      <w:lvlText w:val=""/>
+      <w:lvlJc w:val="left"/>
+      <w:pPr>
+        <w:ind w:left="2880" w:hanging="360"/>
+      </w:pPr>
+      <w:rPr>
+        <w:rFonts w:ascii="Symbol" w:hAnsi="Symbol" w:hint="default"/>
+      </w:rPr>
+    </w:lvl>
+    <w:lvl w:ilvl="4" w:tplc="08090003" w:tentative="1">
+      <w:start w:val="1"/>
+      <w:numFmt w:val="bullet"/>
+      <w:lvlText w:val="o"/>
+      <w:lvlJc w:val="left"/>
+      <w:pPr>
+        <w:ind w:left="3600" w:hanging="360"/>
+      </w:pPr>
+      <w:rPr>
+        <w:rFonts w:ascii="Courier New" w:hAnsi="Courier New" w:cs="Courier New" w:hint="default"/>
+      </w:rPr>
+    </w:lvl>
+    <w:lvl w:ilvl="5" w:tplc="08090005" w:tentative="1">
+      <w:start w:val="1"/>
+      <w:numFmt w:val="bullet"/>
+      <w:lvlText w:val=""/>
+      <w:lvlJc w:val="left"/>
+      <w:pPr>
+        <w:ind w:left="4320" w:hanging="360"/>
+      </w:pPr>
+      <w:rPr>
+        <w:rFonts w:ascii="Wingdings" w:hAnsi="Wingdings" w:hint="default"/>
+      </w:rPr>
+    </w:lvl>
+    <w:lvl w:ilvl="6" w:tplc="08090001" w:tentative="1">
+      <w:start w:val="1"/>
+      <w:numFmt w:val="bullet"/>
+      <w:lvlText w:val=""/>
+      <w:lvlJc w:val="left"/>
+      <w:pPr>
+        <w:ind w:left="5040" w:hanging="360"/>
+      </w:pPr>
+      <w:rPr>
+        <w:rFonts w:ascii="Symbol" w:hAnsi="Symbol" w:hint="default"/>
+      </w:rPr>
+    </w:lvl>
+    <w:lvl w:ilvl="7" w:tplc="08090003" w:tentative="1">
+      <w:start w:val="1"/>
+      <w:numFmt w:val="bullet"/>
+      <w:lvlText w:val="o"/>
+      <w:lvlJc w:val="left"/>
+      <w:pPr>
+        <w:ind w:left="5760" w:hanging="360"/>
+      </w:pPr>
+      <w:rPr>
+        <w:rFonts w:ascii="Courier New" w:hAnsi="Courier New" w:cs="Courier New" w:hint="default"/>
+      </w:rPr>
+    </w:lvl>
+    <w:lvl w:ilvl="8" w:tplc="08090005" w:tentative="1">
+      <w:start w:val="1"/>
+      <w:numFmt w:val="bullet"/>
+      <w:lvlText w:val=""/>
+      <w:lvlJc w:val="left"/>
+      <w:pPr>
+        <w:ind w:left="6480" w:hanging="360"/>
+      </w:pPr>
+      <w:rPr>
+        <w:rFonts w:ascii="Wingdings" w:hAnsi="Wingdings" w:hint="default"/>
+      </w:rPr>
+    </w:lvl>
+  </w:abstractNum>
+  <w:abstractNum w:abstractNumId="1" w15:restartNumberingAfterBreak="0">
     <w:nsid w:val="2ACA4619"/>
     <w:multiLevelType w:val="hybridMultilevel"/>
     <w:tmpl w:val="2C0C15B0"/>
@@ -266,6 +473,9 @@
     </w:lvl>
   </w:abstractNum>
   <w:num w:numId="1" w16cid:durableId="1365670270">
+    <w:abstractNumId w:val="1"/>
+  </w:num>
+  <w:num w:numId="2" w16cid:durableId="1500999047">
     <w:abstractNumId w:val="0"/>
   </w:num>
 </w:numbering>

</xml_diff>

<commit_message>
update to docx and latex
</commit_message>
<xml_diff>
--- a/MongoDB/MongoDB.docx
+++ b/MongoDB/MongoDB.docx
@@ -81,7 +81,19 @@
         </w:numPr>
       </w:pPr>
       <w:r>
-        <w:t xml:space="preserve">Utilizzando degli script in </w:t>
+        <w:t>Usando gli script Python abbiamo corretto alcuni errori di modulo e utilizzato tag non casuali e abbiamo anche analizzato del testo significativo (generato da uno strumento)</w:t>
+      </w:r>
+    </w:p>
+    <w:p>
+      <w:pPr>
+        <w:pStyle w:val="ListParagraph"/>
+        <w:numPr>
+          <w:ilvl w:val="0"/>
+          <w:numId w:val="2"/>
+        </w:numPr>
+      </w:pPr>
+      <w:r>
+        <w:t xml:space="preserve">Sempre con degli script in </w:t>
       </w:r>
       <w:proofErr w:type="spellStart"/>
       <w:r>
@@ -89,7 +101,59 @@
       </w:r>
       <w:proofErr w:type="spellEnd"/>
       <w:r>
-        <w:t xml:space="preserve"> abbiamo aggiustato alcuni errori di forma e utilizzato dei tag e dei testi non casuali.</w:t>
+        <w:t xml:space="preserve"> abbiamo creato delle relazioni (coerenti) e completato il dataset.</w:t>
+      </w:r>
+    </w:p>
+    <w:p>
+      <w:pPr>
+        <w:pStyle w:val="ListParagraph"/>
+        <w:numPr>
+          <w:ilvl w:val="0"/>
+          <w:numId w:val="2"/>
+        </w:numPr>
+      </w:pPr>
+      <w:r>
+        <w:t>L’</w:t>
+      </w:r>
+      <w:proofErr w:type="spellStart"/>
+      <w:r>
+        <w:t>importing</w:t>
+      </w:r>
+      <w:proofErr w:type="spellEnd"/>
+      <w:r>
+        <w:t xml:space="preserve"> su </w:t>
+      </w:r>
+      <w:proofErr w:type="spellStart"/>
+      <w:r>
+        <w:t>mongodb</w:t>
+      </w:r>
+      <w:proofErr w:type="spellEnd"/>
+      <w:r>
+        <w:t xml:space="preserve"> consisteva nel creare due collezioni: </w:t>
+      </w:r>
+      <w:proofErr w:type="spellStart"/>
+      <w:r>
+        <w:t>articles</w:t>
+      </w:r>
+      <w:proofErr w:type="spellEnd"/>
+      <w:r>
+        <w:t xml:space="preserve"> e </w:t>
+      </w:r>
+      <w:proofErr w:type="spellStart"/>
+      <w:r>
+        <w:t>authors</w:t>
+      </w:r>
+      <w:proofErr w:type="spellEnd"/>
+      <w:r>
+        <w:t xml:space="preserve"> e di importare i due </w:t>
+      </w:r>
+      <w:proofErr w:type="spellStart"/>
+      <w:r>
+        <w:t>json</w:t>
+      </w:r>
+      <w:proofErr w:type="spellEnd"/>
+      <w:r>
+        <w:t xml:space="preserve"> generati negli step precedenti.</w:t>
       </w:r>
     </w:p>
     <w:p/>

</xml_diff>

<commit_message>
MongoDB.docx & SprintReview.xlsx updates
</commit_message>
<xml_diff>
--- a/MongoDB/MongoDB.docx
+++ b/MongoDB/MongoDB.docx
@@ -44,12 +44,15 @@
           <w:ilvl w:val="0"/>
           <w:numId w:val="2"/>
         </w:numPr>
-      </w:pPr>
-      <w:r>
-        <w:t xml:space="preserve">Strutturato il DB con un grafico </w:t>
-      </w:r>
-      <w:r>
-        <w:t>a documenti</w:t>
+        <w:rPr>
+          <w:lang w:val="it"/>
+        </w:rPr>
+      </w:pPr>
+      <w:r>
+        <w:rPr>
+          <w:lang w:val="it"/>
+        </w:rPr>
+        <w:t>Strutturato il DB con un grafico a documenti</w:t>
       </w:r>
     </w:p>
     <w:p>
@@ -59,16 +62,28 @@
           <w:ilvl w:val="0"/>
           <w:numId w:val="2"/>
         </w:numPr>
-      </w:pPr>
-      <w:r>
+        <w:rPr>
+          <w:lang w:val="it"/>
+        </w:rPr>
+      </w:pPr>
+      <w:r>
+        <w:rPr>
+          <w:lang w:val="it"/>
+        </w:rPr>
         <w:t xml:space="preserve">Secondo il grafico abbiamo generato i dati con il tool online </w:t>
       </w:r>
       <w:proofErr w:type="spellStart"/>
       <w:r>
+        <w:rPr>
+          <w:lang w:val="it"/>
+        </w:rPr>
         <w:t>mockaroo</w:t>
       </w:r>
       <w:proofErr w:type="spellEnd"/>
       <w:r>
+        <w:rPr>
+          <w:lang w:val="it"/>
+        </w:rPr>
         <w:t xml:space="preserve"> (alcuni casuali, alcuni presi dal vecchio DB utilizzato per Neo4J)</w:t>
       </w:r>
     </w:p>
@@ -79,17 +94,135 @@
           <w:ilvl w:val="0"/>
           <w:numId w:val="2"/>
         </w:numPr>
-      </w:pPr>
-      <w:r>
-        <w:t xml:space="preserve">Utilizzando degli script in </w:t>
+        <w:rPr>
+          <w:lang w:val="it"/>
+        </w:rPr>
+      </w:pPr>
+      <w:r>
+        <w:rPr>
+          <w:lang w:val="it"/>
+        </w:rPr>
+        <w:t>Usando gli script Python abbiamo corretto alcuni errori di modulo e utilizzato tag non casuali e abbiamo anche analizzato del testo significativo (generato da uno strumento)</w:t>
+      </w:r>
+    </w:p>
+    <w:p>
+      <w:pPr>
+        <w:pStyle w:val="ListParagraph"/>
+        <w:numPr>
+          <w:ilvl w:val="0"/>
+          <w:numId w:val="2"/>
+        </w:numPr>
+        <w:rPr>
+          <w:lang w:val="it"/>
+        </w:rPr>
+      </w:pPr>
+      <w:r>
+        <w:rPr>
+          <w:lang w:val="it"/>
+        </w:rPr>
+        <w:t xml:space="preserve">Sempre con degli script in </w:t>
       </w:r>
       <w:proofErr w:type="spellStart"/>
       <w:r>
+        <w:rPr>
+          <w:lang w:val="it"/>
+        </w:rPr>
         <w:t>python</w:t>
       </w:r>
       <w:proofErr w:type="spellEnd"/>
       <w:r>
-        <w:t xml:space="preserve"> abbiamo aggiustato alcuni errori di forma e utilizzato dei tag e dei testi non casuali.</w:t>
+        <w:rPr>
+          <w:lang w:val="it"/>
+        </w:rPr>
+        <w:t xml:space="preserve"> abbiamo creato delle relazioni (coerenti) e completato il dataset.</w:t>
+      </w:r>
+    </w:p>
+    <w:p>
+      <w:pPr>
+        <w:pStyle w:val="ListParagraph"/>
+        <w:numPr>
+          <w:ilvl w:val="0"/>
+          <w:numId w:val="2"/>
+        </w:numPr>
+        <w:rPr>
+          <w:lang w:val="it"/>
+        </w:rPr>
+      </w:pPr>
+      <w:r>
+        <w:rPr>
+          <w:lang w:val="it"/>
+        </w:rPr>
+        <w:t>L’</w:t>
+      </w:r>
+      <w:proofErr w:type="spellStart"/>
+      <w:r>
+        <w:rPr>
+          <w:lang w:val="it"/>
+        </w:rPr>
+        <w:t>importing</w:t>
+      </w:r>
+      <w:proofErr w:type="spellEnd"/>
+      <w:r>
+        <w:rPr>
+          <w:lang w:val="it"/>
+        </w:rPr>
+        <w:t xml:space="preserve"> su </w:t>
+      </w:r>
+      <w:proofErr w:type="spellStart"/>
+      <w:r>
+        <w:rPr>
+          <w:lang w:val="it"/>
+        </w:rPr>
+        <w:t>mongodb</w:t>
+      </w:r>
+      <w:proofErr w:type="spellEnd"/>
+      <w:r>
+        <w:rPr>
+          <w:lang w:val="it"/>
+        </w:rPr>
+        <w:t xml:space="preserve"> consisteva nel creare due collezioni: </w:t>
+      </w:r>
+      <w:proofErr w:type="spellStart"/>
+      <w:r>
+        <w:rPr>
+          <w:lang w:val="it"/>
+        </w:rPr>
+        <w:t>articles</w:t>
+      </w:r>
+      <w:proofErr w:type="spellEnd"/>
+      <w:r>
+        <w:rPr>
+          <w:lang w:val="it"/>
+        </w:rPr>
+        <w:t xml:space="preserve"> e </w:t>
+      </w:r>
+      <w:proofErr w:type="spellStart"/>
+      <w:r>
+        <w:rPr>
+          <w:lang w:val="it"/>
+        </w:rPr>
+        <w:t>authors</w:t>
+      </w:r>
+      <w:proofErr w:type="spellEnd"/>
+      <w:r>
+        <w:rPr>
+          <w:lang w:val="it"/>
+        </w:rPr>
+        <w:t xml:space="preserve"> e di importare i due </w:t>
+      </w:r>
+      <w:proofErr w:type="spellStart"/>
+      <w:r>
+        <w:rPr>
+          <w:lang w:val="it"/>
+        </w:rPr>
+        <w:t>json</w:t>
+      </w:r>
+      <w:proofErr w:type="spellEnd"/>
+      <w:r>
+        <w:rPr>
+          <w:lang w:val="it"/>
+        </w:rPr>
+        <w:t xml:space="preserve"> generati negli step precedenti.</w:t>
       </w:r>
     </w:p>
     <w:p/>
@@ -155,7 +288,7 @@
     <w:p/>
     <w:p>
       <w:pPr>
-        <w:spacing w:line="360" w:lineRule="exact"/>
+        <w:spacing w:after="0" w:line="360" w:lineRule="exact"/>
         <w:rPr>
           <w:rFonts w:ascii="Menlo" w:eastAsia="Menlo" w:hAnsi="Menlo" w:cs="Menlo"/>
           <w:color w:val="000000" w:themeColor="text1"/>
@@ -179,6 +312,7 @@
           <w:color w:val="000000" w:themeColor="text1"/>
           <w:sz w:val="19"/>
           <w:szCs w:val="19"/>
+          <w:highlight w:val="yellow"/>
         </w:rPr>
         <w:t>db.articles.aggregate</w:t>
       </w:r>
@@ -189,10 +323,14 @@
           <w:color w:val="000000" w:themeColor="text1"/>
           <w:sz w:val="19"/>
           <w:szCs w:val="19"/>
+          <w:highlight w:val="yellow"/>
         </w:rPr>
         <w:t>([</w:t>
       </w:r>
       <w:r>
+        <w:rPr>
+          <w:highlight w:val="yellow"/>
+        </w:rPr>
         <w:br/>
       </w:r>
       <w:r>
@@ -201,10 +339,14 @@
           <w:color w:val="000000" w:themeColor="text1"/>
           <w:sz w:val="19"/>
           <w:szCs w:val="19"/>
+          <w:highlight w:val="yellow"/>
         </w:rPr>
         <w:t xml:space="preserve">   {</w:t>
       </w:r>
       <w:r>
+        <w:rPr>
+          <w:highlight w:val="yellow"/>
+        </w:rPr>
         <w:br/>
       </w:r>
       <w:r>
@@ -213,10 +355,14 @@
           <w:color w:val="000000" w:themeColor="text1"/>
           <w:sz w:val="19"/>
           <w:szCs w:val="19"/>
+          <w:highlight w:val="yellow"/>
         </w:rPr>
         <w:t xml:space="preserve">    $match:</w:t>
       </w:r>
       <w:r>
+        <w:rPr>
+          <w:highlight w:val="yellow"/>
+        </w:rPr>
         <w:br/>
       </w:r>
       <w:r>
@@ -225,10 +371,14 @@
           <w:color w:val="000000" w:themeColor="text1"/>
           <w:sz w:val="19"/>
           <w:szCs w:val="19"/>
+          <w:highlight w:val="yellow"/>
         </w:rPr>
         <w:t xml:space="preserve">    {"$and":[</w:t>
       </w:r>
       <w:r>
+        <w:rPr>
+          <w:highlight w:val="yellow"/>
+        </w:rPr>
         <w:br/>
       </w:r>
       <w:r>
@@ -237,6 +387,7 @@
           <w:color w:val="000000" w:themeColor="text1"/>
           <w:sz w:val="19"/>
           <w:szCs w:val="19"/>
+          <w:highlight w:val="yellow"/>
         </w:rPr>
         <w:t xml:space="preserve">       {date:{"$</w:t>
       </w:r>
@@ -247,6 +398,7 @@
           <w:color w:val="000000" w:themeColor="text1"/>
           <w:sz w:val="19"/>
           <w:szCs w:val="19"/>
+          <w:highlight w:val="yellow"/>
         </w:rPr>
         <w:t>gte</w:t>
       </w:r>
@@ -257,10 +409,14 @@
           <w:color w:val="000000" w:themeColor="text1"/>
           <w:sz w:val="19"/>
           <w:szCs w:val="19"/>
+          <w:highlight w:val="yellow"/>
         </w:rPr>
         <w:t>":new Date("2005-01-01")}},</w:t>
       </w:r>
       <w:r>
+        <w:rPr>
+          <w:highlight w:val="yellow"/>
+        </w:rPr>
         <w:br/>
       </w:r>
       <w:r>
@@ -269,6 +425,7 @@
           <w:color w:val="000000" w:themeColor="text1"/>
           <w:sz w:val="19"/>
           <w:szCs w:val="19"/>
+          <w:highlight w:val="yellow"/>
         </w:rPr>
         <w:t xml:space="preserve">        {tags:"#</w:t>
       </w:r>
@@ -279,6 +436,7 @@
           <w:color w:val="000000" w:themeColor="text1"/>
           <w:sz w:val="19"/>
           <w:szCs w:val="19"/>
+          <w:highlight w:val="yellow"/>
         </w:rPr>
         <w:t>datascience</w:t>
       </w:r>
@@ -289,10 +447,14 @@
           <w:color w:val="000000" w:themeColor="text1"/>
           <w:sz w:val="19"/>
           <w:szCs w:val="19"/>
+          <w:highlight w:val="yellow"/>
         </w:rPr>
         <w:t>"}</w:t>
       </w:r>
       <w:r>
+        <w:rPr>
+          <w:highlight w:val="yellow"/>
+        </w:rPr>
         <w:br/>
       </w:r>
       <w:r>
@@ -301,10 +463,14 @@
           <w:color w:val="000000" w:themeColor="text1"/>
           <w:sz w:val="19"/>
           <w:szCs w:val="19"/>
+          <w:highlight w:val="yellow"/>
         </w:rPr>
         <w:t xml:space="preserve">        ]</w:t>
       </w:r>
       <w:r>
+        <w:rPr>
+          <w:highlight w:val="yellow"/>
+        </w:rPr>
         <w:br/>
       </w:r>
       <w:r>
@@ -313,10 +479,14 @@
           <w:color w:val="000000" w:themeColor="text1"/>
           <w:sz w:val="19"/>
           <w:szCs w:val="19"/>
+          <w:highlight w:val="yellow"/>
         </w:rPr>
         <w:t xml:space="preserve">    }</w:t>
       </w:r>
       <w:r>
+        <w:rPr>
+          <w:highlight w:val="yellow"/>
+        </w:rPr>
         <w:br/>
       </w:r>
       <w:r>
@@ -325,10 +495,14 @@
           <w:color w:val="000000" w:themeColor="text1"/>
           <w:sz w:val="19"/>
           <w:szCs w:val="19"/>
+          <w:highlight w:val="yellow"/>
         </w:rPr>
         <w:t xml:space="preserve">   },</w:t>
       </w:r>
       <w:r>
+        <w:rPr>
+          <w:highlight w:val="yellow"/>
+        </w:rPr>
         <w:br/>
       </w:r>
       <w:r>
@@ -337,10 +511,14 @@
           <w:color w:val="000000" w:themeColor="text1"/>
           <w:sz w:val="19"/>
           <w:szCs w:val="19"/>
+          <w:highlight w:val="yellow"/>
         </w:rPr>
         <w:t xml:space="preserve">   {</w:t>
       </w:r>
       <w:r>
+        <w:rPr>
+          <w:highlight w:val="yellow"/>
+        </w:rPr>
         <w:br/>
       </w:r>
       <w:r>
@@ -349,10 +527,14 @@
           <w:color w:val="000000" w:themeColor="text1"/>
           <w:sz w:val="19"/>
           <w:szCs w:val="19"/>
+          <w:highlight w:val="yellow"/>
         </w:rPr>
         <w:t xml:space="preserve">      $project:{</w:t>
       </w:r>
       <w:r>
+        <w:rPr>
+          <w:highlight w:val="yellow"/>
+        </w:rPr>
         <w:br/>
       </w:r>
       <w:r>
@@ -361,10 +543,14 @@
           <w:color w:val="000000" w:themeColor="text1"/>
           <w:sz w:val="19"/>
           <w:szCs w:val="19"/>
+          <w:highlight w:val="yellow"/>
         </w:rPr>
         <w:t xml:space="preserve">          title:1,</w:t>
       </w:r>
       <w:r>
+        <w:rPr>
+          <w:highlight w:val="yellow"/>
+        </w:rPr>
         <w:br/>
       </w:r>
       <w:r>
@@ -373,10 +559,14 @@
           <w:color w:val="000000" w:themeColor="text1"/>
           <w:sz w:val="19"/>
           <w:szCs w:val="19"/>
+          <w:highlight w:val="yellow"/>
         </w:rPr>
         <w:t xml:space="preserve">          tags:1,</w:t>
       </w:r>
       <w:r>
+        <w:rPr>
+          <w:highlight w:val="yellow"/>
+        </w:rPr>
         <w:br/>
       </w:r>
       <w:r>
@@ -385,10 +575,14 @@
           <w:color w:val="000000" w:themeColor="text1"/>
           <w:sz w:val="19"/>
           <w:szCs w:val="19"/>
+          <w:highlight w:val="yellow"/>
         </w:rPr>
         <w:t xml:space="preserve">          date:1,</w:t>
       </w:r>
       <w:r>
+        <w:rPr>
+          <w:highlight w:val="yellow"/>
+        </w:rPr>
         <w:br/>
       </w:r>
       <w:r>
@@ -397,6 +591,7 @@
           <w:color w:val="000000" w:themeColor="text1"/>
           <w:sz w:val="19"/>
           <w:szCs w:val="19"/>
+          <w:highlight w:val="yellow"/>
         </w:rPr>
         <w:t xml:space="preserve">         </w:t>
       </w:r>
@@ -407,6 +602,7 @@
           <w:color w:val="000000" w:themeColor="text1"/>
           <w:sz w:val="19"/>
           <w:szCs w:val="19"/>
+          <w:highlight w:val="yellow"/>
         </w:rPr>
         <w:t>numAuthors</w:t>
       </w:r>
@@ -417,6 +613,7 @@
           <w:color w:val="000000" w:themeColor="text1"/>
           <w:sz w:val="19"/>
           <w:szCs w:val="19"/>
+          <w:highlight w:val="yellow"/>
         </w:rPr>
         <w:t>: { $</w:t>
       </w:r>
@@ -427,6 +624,7 @@
           <w:color w:val="000000" w:themeColor="text1"/>
           <w:sz w:val="19"/>
           <w:szCs w:val="19"/>
+          <w:highlight w:val="yellow"/>
         </w:rPr>
         <w:t>cond</w:t>
       </w:r>
@@ -437,6 +635,7 @@
           <w:color w:val="000000" w:themeColor="text1"/>
           <w:sz w:val="19"/>
           <w:szCs w:val="19"/>
+          <w:highlight w:val="yellow"/>
         </w:rPr>
         <w:t xml:space="preserve">: { </w:t>
       </w:r>
@@ -447,6 +646,7 @@
           <w:color w:val="000000" w:themeColor="text1"/>
           <w:sz w:val="19"/>
           <w:szCs w:val="19"/>
+          <w:highlight w:val="yellow"/>
         </w:rPr>
         <w:t>if</w:t>
       </w:r>
@@ -457,6 +657,7 @@
           <w:color w:val="000000" w:themeColor="text1"/>
           <w:sz w:val="19"/>
           <w:szCs w:val="19"/>
+          <w:highlight w:val="yellow"/>
         </w:rPr>
         <w:t>: { $</w:t>
       </w:r>
@@ -467,6 +668,7 @@
           <w:color w:val="000000" w:themeColor="text1"/>
           <w:sz w:val="19"/>
           <w:szCs w:val="19"/>
+          <w:highlight w:val="yellow"/>
         </w:rPr>
         <w:t>isArray</w:t>
       </w:r>
@@ -477,6 +679,7 @@
           <w:color w:val="000000" w:themeColor="text1"/>
           <w:sz w:val="19"/>
           <w:szCs w:val="19"/>
+          <w:highlight w:val="yellow"/>
         </w:rPr>
         <w:t>: "$</w:t>
       </w:r>
@@ -487,6 +690,7 @@
           <w:color w:val="000000" w:themeColor="text1"/>
           <w:sz w:val="19"/>
           <w:szCs w:val="19"/>
+          <w:highlight w:val="yellow"/>
         </w:rPr>
         <w:t>authors</w:t>
       </w:r>
@@ -497,6 +701,7 @@
           <w:color w:val="000000" w:themeColor="text1"/>
           <w:sz w:val="19"/>
           <w:szCs w:val="19"/>
+          <w:highlight w:val="yellow"/>
         </w:rPr>
         <w:t xml:space="preserve">" }, </w:t>
       </w:r>
@@ -507,6 +712,7 @@
           <w:color w:val="000000" w:themeColor="text1"/>
           <w:sz w:val="19"/>
           <w:szCs w:val="19"/>
+          <w:highlight w:val="yellow"/>
         </w:rPr>
         <w:t>then</w:t>
       </w:r>
@@ -517,6 +723,7 @@
           <w:color w:val="000000" w:themeColor="text1"/>
           <w:sz w:val="19"/>
           <w:szCs w:val="19"/>
+          <w:highlight w:val="yellow"/>
         </w:rPr>
         <w:t>: { $size: "$</w:t>
       </w:r>
@@ -527,6 +734,7 @@
           <w:color w:val="000000" w:themeColor="text1"/>
           <w:sz w:val="19"/>
           <w:szCs w:val="19"/>
+          <w:highlight w:val="yellow"/>
         </w:rPr>
         <w:t>authors</w:t>
       </w:r>
@@ -537,10 +745,14 @@
           <w:color w:val="000000" w:themeColor="text1"/>
           <w:sz w:val="19"/>
           <w:szCs w:val="19"/>
+          <w:highlight w:val="yellow"/>
         </w:rPr>
         <w:t>" }, else: "NA"} }</w:t>
       </w:r>
       <w:r>
+        <w:rPr>
+          <w:highlight w:val="yellow"/>
+        </w:rPr>
         <w:br/>
       </w:r>
       <w:r>
@@ -549,10 +761,14 @@
           <w:color w:val="000000" w:themeColor="text1"/>
           <w:sz w:val="19"/>
           <w:szCs w:val="19"/>
+          <w:highlight w:val="yellow"/>
         </w:rPr>
         <w:t xml:space="preserve">      }</w:t>
       </w:r>
       <w:r>
+        <w:rPr>
+          <w:highlight w:val="yellow"/>
+        </w:rPr>
         <w:br/>
       </w:r>
       <w:r>
@@ -561,10 +777,14 @@
           <w:color w:val="000000" w:themeColor="text1"/>
           <w:sz w:val="19"/>
           <w:szCs w:val="19"/>
+          <w:highlight w:val="yellow"/>
         </w:rPr>
         <w:t xml:space="preserve">   },</w:t>
       </w:r>
       <w:r>
+        <w:rPr>
+          <w:highlight w:val="yellow"/>
+        </w:rPr>
         <w:br/>
       </w:r>
       <w:r>
@@ -573,10 +793,14 @@
           <w:color w:val="000000" w:themeColor="text1"/>
           <w:sz w:val="19"/>
           <w:szCs w:val="19"/>
+          <w:highlight w:val="yellow"/>
         </w:rPr>
         <w:t xml:space="preserve">   {</w:t>
       </w:r>
       <w:r>
+        <w:rPr>
+          <w:highlight w:val="yellow"/>
+        </w:rPr>
         <w:br/>
       </w:r>
       <w:r>
@@ -585,6 +809,7 @@
           <w:color w:val="000000" w:themeColor="text1"/>
           <w:sz w:val="19"/>
           <w:szCs w:val="19"/>
+          <w:highlight w:val="yellow"/>
         </w:rPr>
         <w:t xml:space="preserve">       $sort : { </w:t>
       </w:r>
@@ -595,6 +820,7 @@
           <w:color w:val="000000" w:themeColor="text1"/>
           <w:sz w:val="19"/>
           <w:szCs w:val="19"/>
+          <w:highlight w:val="yellow"/>
         </w:rPr>
         <w:t>numAuthors</w:t>
       </w:r>
@@ -605,10 +831,14 @@
           <w:color w:val="000000" w:themeColor="text1"/>
           <w:sz w:val="19"/>
           <w:szCs w:val="19"/>
+          <w:highlight w:val="yellow"/>
         </w:rPr>
         <w:t xml:space="preserve"> : -1 }</w:t>
       </w:r>
       <w:r>
+        <w:rPr>
+          <w:highlight w:val="yellow"/>
+        </w:rPr>
         <w:br/>
       </w:r>
       <w:r>
@@ -617,10 +847,14 @@
           <w:color w:val="000000" w:themeColor="text1"/>
           <w:sz w:val="19"/>
           <w:szCs w:val="19"/>
+          <w:highlight w:val="yellow"/>
         </w:rPr>
         <w:t xml:space="preserve">   },</w:t>
       </w:r>
       <w:r>
+        <w:rPr>
+          <w:highlight w:val="yellow"/>
+        </w:rPr>
         <w:br/>
       </w:r>
       <w:r>
@@ -629,10 +863,14 @@
           <w:color w:val="000000" w:themeColor="text1"/>
           <w:sz w:val="19"/>
           <w:szCs w:val="19"/>
+          <w:highlight w:val="yellow"/>
         </w:rPr>
         <w:t xml:space="preserve">   {</w:t>
       </w:r>
       <w:r>
+        <w:rPr>
+          <w:highlight w:val="yellow"/>
+        </w:rPr>
         <w:br/>
       </w:r>
       <w:r>
@@ -641,10 +879,14 @@
           <w:color w:val="000000" w:themeColor="text1"/>
           <w:sz w:val="19"/>
           <w:szCs w:val="19"/>
+          <w:highlight w:val="yellow"/>
         </w:rPr>
         <w:t xml:space="preserve">     $limit:5</w:t>
       </w:r>
       <w:r>
+        <w:rPr>
+          <w:highlight w:val="yellow"/>
+        </w:rPr>
         <w:br/>
       </w:r>
       <w:r>
@@ -653,10 +895,14 @@
           <w:color w:val="000000" w:themeColor="text1"/>
           <w:sz w:val="19"/>
           <w:szCs w:val="19"/>
+          <w:highlight w:val="yellow"/>
         </w:rPr>
         <w:t xml:space="preserve">   }</w:t>
       </w:r>
       <w:r>
+        <w:rPr>
+          <w:highlight w:val="yellow"/>
+        </w:rPr>
         <w:br/>
       </w:r>
       <w:r>
@@ -665,6 +911,7 @@
           <w:color w:val="000000" w:themeColor="text1"/>
           <w:sz w:val="19"/>
           <w:szCs w:val="19"/>
+          <w:highlight w:val="yellow"/>
         </w:rPr>
         <w:t>] )</w:t>
       </w:r>
@@ -1575,10 +1822,12 @@
     </w:p>
     <w:p>
       <w:pPr>
-        <w:rPr>
-          <w:rFonts w:ascii="Menlo" w:eastAsia="Menlo" w:hAnsi="Menlo" w:cs="Menlo"/>
-          <w:sz w:val="19"/>
-          <w:szCs w:val="19"/>
+        <w:spacing w:after="0"/>
+        <w:rPr>
+          <w:rFonts w:ascii="Menlo" w:eastAsia="Menlo" w:hAnsi="Menlo" w:cs="Menlo"/>
+          <w:sz w:val="19"/>
+          <w:szCs w:val="19"/>
+          <w:highlight w:val="yellow"/>
           <w:lang w:val="en-US"/>
         </w:rPr>
       </w:pPr>
@@ -1589,6 +1838,7 @@
           <w:rFonts w:ascii="Menlo" w:eastAsia="Menlo" w:hAnsi="Menlo" w:cs="Menlo"/>
           <w:sz w:val="19"/>
           <w:szCs w:val="19"/>
+          <w:highlight w:val="yellow"/>
           <w:lang w:val="en-US"/>
         </w:rPr>
         <w:t>db.articles</w:t>
@@ -1599,6 +1849,7 @@
           <w:rFonts w:ascii="Menlo" w:eastAsia="Menlo" w:hAnsi="Menlo" w:cs="Menlo"/>
           <w:sz w:val="19"/>
           <w:szCs w:val="19"/>
+          <w:highlight w:val="yellow"/>
           <w:lang w:val="en-US"/>
         </w:rPr>
         <w:t>.aggregate</w:t>
@@ -1609,6 +1860,7 @@
           <w:rFonts w:ascii="Menlo" w:eastAsia="Menlo" w:hAnsi="Menlo" w:cs="Menlo"/>
           <w:sz w:val="19"/>
           <w:szCs w:val="19"/>
+          <w:highlight w:val="yellow"/>
           <w:lang w:val="en-US"/>
         </w:rPr>
         <w:t>([</w:t>
@@ -1616,15 +1868,18 @@
     </w:p>
     <w:p>
       <w:pPr>
-        <w:rPr>
-          <w:lang w:val="en-US"/>
-        </w:rPr>
-      </w:pPr>
-      <w:r>
-        <w:rPr>
-          <w:rFonts w:ascii="Menlo" w:eastAsia="Menlo" w:hAnsi="Menlo" w:cs="Menlo"/>
-          <w:sz w:val="19"/>
-          <w:szCs w:val="19"/>
+        <w:spacing w:after="0"/>
+        <w:rPr>
+          <w:highlight w:val="yellow"/>
+          <w:lang w:val="en-US"/>
+        </w:rPr>
+      </w:pPr>
+      <w:r>
+        <w:rPr>
+          <w:rFonts w:ascii="Menlo" w:eastAsia="Menlo" w:hAnsi="Menlo" w:cs="Menlo"/>
+          <w:sz w:val="19"/>
+          <w:szCs w:val="19"/>
+          <w:highlight w:val="yellow"/>
           <w:lang w:val="en-US"/>
         </w:rPr>
         <w:t xml:space="preserve">   {</w:t>
@@ -1632,15 +1887,18 @@
     </w:p>
     <w:p>
       <w:pPr>
-        <w:rPr>
-          <w:lang w:val="en-US"/>
-        </w:rPr>
-      </w:pPr>
-      <w:r>
-        <w:rPr>
-          <w:rFonts w:ascii="Menlo" w:eastAsia="Menlo" w:hAnsi="Menlo" w:cs="Menlo"/>
-          <w:sz w:val="19"/>
-          <w:szCs w:val="19"/>
+        <w:spacing w:after="0"/>
+        <w:rPr>
+          <w:highlight w:val="yellow"/>
+          <w:lang w:val="en-US"/>
+        </w:rPr>
+      </w:pPr>
+      <w:r>
+        <w:rPr>
+          <w:rFonts w:ascii="Menlo" w:eastAsia="Menlo" w:hAnsi="Menlo" w:cs="Menlo"/>
+          <w:sz w:val="19"/>
+          <w:szCs w:val="19"/>
+          <w:highlight w:val="yellow"/>
           <w:lang w:val="en-US"/>
         </w:rPr>
         <w:t xml:space="preserve">      $match:</w:t>
@@ -1648,15 +1906,18 @@
     </w:p>
     <w:p>
       <w:pPr>
-        <w:rPr>
-          <w:lang w:val="en-US"/>
-        </w:rPr>
-      </w:pPr>
-      <w:r>
-        <w:rPr>
-          <w:rFonts w:ascii="Menlo" w:eastAsia="Menlo" w:hAnsi="Menlo" w:cs="Menlo"/>
-          <w:sz w:val="19"/>
-          <w:szCs w:val="19"/>
+        <w:spacing w:after="0"/>
+        <w:rPr>
+          <w:highlight w:val="yellow"/>
+          <w:lang w:val="en-US"/>
+        </w:rPr>
+      </w:pPr>
+      <w:r>
+        <w:rPr>
+          <w:rFonts w:ascii="Menlo" w:eastAsia="Menlo" w:hAnsi="Menlo" w:cs="Menlo"/>
+          <w:sz w:val="19"/>
+          <w:szCs w:val="19"/>
+          <w:highlight w:val="yellow"/>
           <w:lang w:val="en-US"/>
         </w:rPr>
         <w:t xml:space="preserve">        {date: {</w:t>
@@ -1664,15 +1925,18 @@
     </w:p>
     <w:p>
       <w:pPr>
-        <w:rPr>
-          <w:lang w:val="en-US"/>
-        </w:rPr>
-      </w:pPr>
-      <w:r>
-        <w:rPr>
-          <w:rFonts w:ascii="Menlo" w:eastAsia="Menlo" w:hAnsi="Menlo" w:cs="Menlo"/>
-          <w:sz w:val="19"/>
-          <w:szCs w:val="19"/>
+        <w:spacing w:after="0"/>
+        <w:rPr>
+          <w:highlight w:val="yellow"/>
+          <w:lang w:val="en-US"/>
+        </w:rPr>
+      </w:pPr>
+      <w:r>
+        <w:rPr>
+          <w:rFonts w:ascii="Menlo" w:eastAsia="Menlo" w:hAnsi="Menlo" w:cs="Menlo"/>
+          <w:sz w:val="19"/>
+          <w:szCs w:val="19"/>
+          <w:highlight w:val="yellow"/>
           <w:lang w:val="en-US"/>
         </w:rPr>
         <w:t xml:space="preserve">          "$</w:t>
@@ -1683,6 +1947,7 @@
           <w:rFonts w:ascii="Menlo" w:eastAsia="Menlo" w:hAnsi="Menlo" w:cs="Menlo"/>
           <w:sz w:val="19"/>
           <w:szCs w:val="19"/>
+          <w:highlight w:val="yellow"/>
           <w:lang w:val="en-US"/>
         </w:rPr>
         <w:t>gte</w:t>
@@ -1694,6 +1959,7 @@
           <w:rFonts w:ascii="Menlo" w:eastAsia="Menlo" w:hAnsi="Menlo" w:cs="Menlo"/>
           <w:sz w:val="19"/>
           <w:szCs w:val="19"/>
+          <w:highlight w:val="yellow"/>
           <w:lang w:val="en-US"/>
         </w:rPr>
         <w:t>":new</w:t>
@@ -1704,6 +1970,7 @@
           <w:rFonts w:ascii="Menlo" w:eastAsia="Menlo" w:hAnsi="Menlo" w:cs="Menlo"/>
           <w:sz w:val="19"/>
           <w:szCs w:val="19"/>
+          <w:highlight w:val="yellow"/>
           <w:lang w:val="en-US"/>
         </w:rPr>
         <w:t xml:space="preserve"> Date("2000-01-01"),</w:t>
@@ -1711,15 +1978,18 @@
     </w:p>
     <w:p>
       <w:pPr>
-        <w:rPr>
-          <w:lang w:val="en-US"/>
-        </w:rPr>
-      </w:pPr>
-      <w:r>
-        <w:rPr>
-          <w:rFonts w:ascii="Menlo" w:eastAsia="Menlo" w:hAnsi="Menlo" w:cs="Menlo"/>
-          <w:sz w:val="19"/>
-          <w:szCs w:val="19"/>
+        <w:spacing w:after="0"/>
+        <w:rPr>
+          <w:highlight w:val="yellow"/>
+          <w:lang w:val="en-US"/>
+        </w:rPr>
+      </w:pPr>
+      <w:r>
+        <w:rPr>
+          <w:rFonts w:ascii="Menlo" w:eastAsia="Menlo" w:hAnsi="Menlo" w:cs="Menlo"/>
+          <w:sz w:val="19"/>
+          <w:szCs w:val="19"/>
+          <w:highlight w:val="yellow"/>
           <w:lang w:val="en-US"/>
         </w:rPr>
         <w:t xml:space="preserve">          "$</w:t>
@@ -1730,6 +2000,7 @@
           <w:rFonts w:ascii="Menlo" w:eastAsia="Menlo" w:hAnsi="Menlo" w:cs="Menlo"/>
           <w:sz w:val="19"/>
           <w:szCs w:val="19"/>
+          <w:highlight w:val="yellow"/>
           <w:lang w:val="en-US"/>
         </w:rPr>
         <w:t>lt</w:t>
@@ -1741,6 +2012,7 @@
           <w:rFonts w:ascii="Menlo" w:eastAsia="Menlo" w:hAnsi="Menlo" w:cs="Menlo"/>
           <w:sz w:val="19"/>
           <w:szCs w:val="19"/>
+          <w:highlight w:val="yellow"/>
           <w:lang w:val="en-US"/>
         </w:rPr>
         <w:t>":new</w:t>
@@ -1751,6 +2023,7 @@
           <w:rFonts w:ascii="Menlo" w:eastAsia="Menlo" w:hAnsi="Menlo" w:cs="Menlo"/>
           <w:sz w:val="19"/>
           <w:szCs w:val="19"/>
+          <w:highlight w:val="yellow"/>
           <w:lang w:val="en-US"/>
         </w:rPr>
         <w:t xml:space="preserve"> Date("2019-01-01"),</w:t>
@@ -1758,31 +2031,37 @@
     </w:p>
     <w:p>
       <w:pPr>
-        <w:rPr>
-          <w:lang w:val="en-US"/>
-        </w:rPr>
-      </w:pPr>
-      <w:r>
-        <w:rPr>
-          <w:rFonts w:ascii="Menlo" w:eastAsia="Menlo" w:hAnsi="Menlo" w:cs="Menlo"/>
-          <w:sz w:val="19"/>
-          <w:szCs w:val="19"/>
-          <w:lang w:val="en-US"/>
-        </w:rPr>
-        <w:t xml:space="preserve">          </w:t>
-      </w:r>
-    </w:p>
-    <w:p>
-      <w:pPr>
-        <w:rPr>
-          <w:lang w:val="en-US"/>
-        </w:rPr>
-      </w:pPr>
-      <w:r>
-        <w:rPr>
-          <w:rFonts w:ascii="Menlo" w:eastAsia="Menlo" w:hAnsi="Menlo" w:cs="Menlo"/>
-          <w:sz w:val="19"/>
-          <w:szCs w:val="19"/>
+        <w:spacing w:after="0"/>
+        <w:rPr>
+          <w:highlight w:val="yellow"/>
+          <w:lang w:val="en-US"/>
+        </w:rPr>
+      </w:pPr>
+      <w:r>
+        <w:rPr>
+          <w:rFonts w:ascii="Menlo" w:eastAsia="Menlo" w:hAnsi="Menlo" w:cs="Menlo"/>
+          <w:sz w:val="19"/>
+          <w:szCs w:val="19"/>
+          <w:highlight w:val="yellow"/>
+          <w:lang w:val="en-US"/>
+        </w:rPr>
+        <w:t xml:space="preserve">        }          </w:t>
+      </w:r>
+    </w:p>
+    <w:p>
+      <w:pPr>
+        <w:spacing w:after="0"/>
+        <w:rPr>
+          <w:highlight w:val="yellow"/>
+          <w:lang w:val="en-US"/>
+        </w:rPr>
+      </w:pPr>
+      <w:r>
+        <w:rPr>
+          <w:rFonts w:ascii="Menlo" w:eastAsia="Menlo" w:hAnsi="Menlo" w:cs="Menlo"/>
+          <w:sz w:val="19"/>
+          <w:szCs w:val="19"/>
+          <w:highlight w:val="yellow"/>
           <w:lang w:val="en-US"/>
         </w:rPr>
         <w:t xml:space="preserve">        }</w:t>
@@ -1790,47 +2069,18 @@
     </w:p>
     <w:p>
       <w:pPr>
-        <w:rPr>
-          <w:lang w:val="en-US"/>
-        </w:rPr>
-      </w:pPr>
-      <w:r>
-        <w:rPr>
-          <w:rFonts w:ascii="Menlo" w:eastAsia="Menlo" w:hAnsi="Menlo" w:cs="Menlo"/>
-          <w:sz w:val="19"/>
-          <w:szCs w:val="19"/>
-          <w:lang w:val="en-US"/>
-        </w:rPr>
-        <w:t xml:space="preserve">          </w:t>
-      </w:r>
-    </w:p>
-    <w:p>
-      <w:pPr>
-        <w:rPr>
-          <w:lang w:val="en-US"/>
-        </w:rPr>
-      </w:pPr>
-      <w:r>
-        <w:rPr>
-          <w:rFonts w:ascii="Menlo" w:eastAsia="Menlo" w:hAnsi="Menlo" w:cs="Menlo"/>
-          <w:sz w:val="19"/>
-          <w:szCs w:val="19"/>
-          <w:lang w:val="en-US"/>
-        </w:rPr>
-        <w:t xml:space="preserve">        }</w:t>
-      </w:r>
-    </w:p>
-    <w:p>
-      <w:pPr>
-        <w:rPr>
-          <w:lang w:val="en-US"/>
-        </w:rPr>
-      </w:pPr>
-      <w:r>
-        <w:rPr>
-          <w:rFonts w:ascii="Menlo" w:eastAsia="Menlo" w:hAnsi="Menlo" w:cs="Menlo"/>
-          <w:sz w:val="19"/>
-          <w:szCs w:val="19"/>
+        <w:spacing w:after="0"/>
+        <w:rPr>
+          <w:highlight w:val="yellow"/>
+          <w:lang w:val="en-US"/>
+        </w:rPr>
+      </w:pPr>
+      <w:r>
+        <w:rPr>
+          <w:rFonts w:ascii="Menlo" w:eastAsia="Menlo" w:hAnsi="Menlo" w:cs="Menlo"/>
+          <w:sz w:val="19"/>
+          <w:szCs w:val="19"/>
+          <w:highlight w:val="yellow"/>
           <w:lang w:val="en-US"/>
         </w:rPr>
         <w:t xml:space="preserve">   },</w:t>
@@ -1838,15 +2088,18 @@
     </w:p>
     <w:p>
       <w:pPr>
-        <w:rPr>
-          <w:lang w:val="en-US"/>
-        </w:rPr>
-      </w:pPr>
-      <w:r>
-        <w:rPr>
-          <w:rFonts w:ascii="Menlo" w:eastAsia="Menlo" w:hAnsi="Menlo" w:cs="Menlo"/>
-          <w:sz w:val="19"/>
-          <w:szCs w:val="19"/>
+        <w:spacing w:after="0"/>
+        <w:rPr>
+          <w:highlight w:val="yellow"/>
+          <w:lang w:val="en-US"/>
+        </w:rPr>
+      </w:pPr>
+      <w:r>
+        <w:rPr>
+          <w:rFonts w:ascii="Menlo" w:eastAsia="Menlo" w:hAnsi="Menlo" w:cs="Menlo"/>
+          <w:sz w:val="19"/>
+          <w:szCs w:val="19"/>
+          <w:highlight w:val="yellow"/>
           <w:lang w:val="en-US"/>
         </w:rPr>
         <w:t xml:space="preserve">   {</w:t>
@@ -1854,15 +2107,18 @@
     </w:p>
     <w:p>
       <w:pPr>
-        <w:rPr>
-          <w:lang w:val="en-US"/>
-        </w:rPr>
-      </w:pPr>
-      <w:r>
-        <w:rPr>
-          <w:rFonts w:ascii="Menlo" w:eastAsia="Menlo" w:hAnsi="Menlo" w:cs="Menlo"/>
-          <w:sz w:val="19"/>
-          <w:szCs w:val="19"/>
+        <w:spacing w:after="0"/>
+        <w:rPr>
+          <w:highlight w:val="yellow"/>
+          <w:lang w:val="en-US"/>
+        </w:rPr>
+      </w:pPr>
+      <w:r>
+        <w:rPr>
+          <w:rFonts w:ascii="Menlo" w:eastAsia="Menlo" w:hAnsi="Menlo" w:cs="Menlo"/>
+          <w:sz w:val="19"/>
+          <w:szCs w:val="19"/>
+          <w:highlight w:val="yellow"/>
           <w:lang w:val="en-US"/>
         </w:rPr>
         <w:t xml:space="preserve">     $unwind:"$tags"</w:t>
@@ -1870,15 +2126,18 @@
     </w:p>
     <w:p>
       <w:pPr>
-        <w:rPr>
-          <w:lang w:val="en-US"/>
-        </w:rPr>
-      </w:pPr>
-      <w:r>
-        <w:rPr>
-          <w:rFonts w:ascii="Menlo" w:eastAsia="Menlo" w:hAnsi="Menlo" w:cs="Menlo"/>
-          <w:sz w:val="19"/>
-          <w:szCs w:val="19"/>
+        <w:spacing w:after="0"/>
+        <w:rPr>
+          <w:highlight w:val="yellow"/>
+          <w:lang w:val="en-US"/>
+        </w:rPr>
+      </w:pPr>
+      <w:r>
+        <w:rPr>
+          <w:rFonts w:ascii="Menlo" w:eastAsia="Menlo" w:hAnsi="Menlo" w:cs="Menlo"/>
+          <w:sz w:val="19"/>
+          <w:szCs w:val="19"/>
+          <w:highlight w:val="yellow"/>
           <w:lang w:val="en-US"/>
         </w:rPr>
         <w:t xml:space="preserve">   },</w:t>
@@ -1886,15 +2145,18 @@
     </w:p>
     <w:p>
       <w:pPr>
-        <w:rPr>
-          <w:lang w:val="en-US"/>
-        </w:rPr>
-      </w:pPr>
-      <w:r>
-        <w:rPr>
-          <w:rFonts w:ascii="Menlo" w:eastAsia="Menlo" w:hAnsi="Menlo" w:cs="Menlo"/>
-          <w:sz w:val="19"/>
-          <w:szCs w:val="19"/>
+        <w:spacing w:after="0"/>
+        <w:rPr>
+          <w:highlight w:val="yellow"/>
+          <w:lang w:val="en-US"/>
+        </w:rPr>
+      </w:pPr>
+      <w:r>
+        <w:rPr>
+          <w:rFonts w:ascii="Menlo" w:eastAsia="Menlo" w:hAnsi="Menlo" w:cs="Menlo"/>
+          <w:sz w:val="19"/>
+          <w:szCs w:val="19"/>
+          <w:highlight w:val="yellow"/>
           <w:lang w:val="en-US"/>
         </w:rPr>
         <w:t xml:space="preserve">   {</w:t>
@@ -1902,15 +2164,18 @@
     </w:p>
     <w:p>
       <w:pPr>
-        <w:rPr>
-          <w:lang w:val="en-US"/>
-        </w:rPr>
-      </w:pPr>
-      <w:r>
-        <w:rPr>
-          <w:rFonts w:ascii="Menlo" w:eastAsia="Menlo" w:hAnsi="Menlo" w:cs="Menlo"/>
-          <w:sz w:val="19"/>
-          <w:szCs w:val="19"/>
+        <w:spacing w:after="0"/>
+        <w:rPr>
+          <w:highlight w:val="yellow"/>
+          <w:lang w:val="en-US"/>
+        </w:rPr>
+      </w:pPr>
+      <w:r>
+        <w:rPr>
+          <w:rFonts w:ascii="Menlo" w:eastAsia="Menlo" w:hAnsi="Menlo" w:cs="Menlo"/>
+          <w:sz w:val="19"/>
+          <w:szCs w:val="19"/>
+          <w:highlight w:val="yellow"/>
           <w:lang w:val="en-US"/>
         </w:rPr>
         <w:t xml:space="preserve">     $</w:t>
@@ -1921,6 +2186,7 @@
           <w:rFonts w:ascii="Menlo" w:eastAsia="Menlo" w:hAnsi="Menlo" w:cs="Menlo"/>
           <w:sz w:val="19"/>
           <w:szCs w:val="19"/>
+          <w:highlight w:val="yellow"/>
           <w:lang w:val="en-US"/>
         </w:rPr>
         <w:t>group:{</w:t>
@@ -1931,6 +2197,7 @@
           <w:rFonts w:ascii="Menlo" w:eastAsia="Menlo" w:hAnsi="Menlo" w:cs="Menlo"/>
           <w:sz w:val="19"/>
           <w:szCs w:val="19"/>
+          <w:highlight w:val="yellow"/>
           <w:lang w:val="en-US"/>
         </w:rPr>
         <w:t xml:space="preserve">  _id:{year:{$year:"$date"} , tag:"$tags"}, count:{$sum:1} }</w:t>
@@ -1938,15 +2205,18 @@
     </w:p>
     <w:p>
       <w:pPr>
-        <w:rPr>
-          <w:lang w:val="en-US"/>
-        </w:rPr>
-      </w:pPr>
-      <w:r>
-        <w:rPr>
-          <w:rFonts w:ascii="Menlo" w:eastAsia="Menlo" w:hAnsi="Menlo" w:cs="Menlo"/>
-          <w:sz w:val="19"/>
-          <w:szCs w:val="19"/>
+        <w:spacing w:after="0"/>
+        <w:rPr>
+          <w:highlight w:val="yellow"/>
+          <w:lang w:val="en-US"/>
+        </w:rPr>
+      </w:pPr>
+      <w:r>
+        <w:rPr>
+          <w:rFonts w:ascii="Menlo" w:eastAsia="Menlo" w:hAnsi="Menlo" w:cs="Menlo"/>
+          <w:sz w:val="19"/>
+          <w:szCs w:val="19"/>
+          <w:highlight w:val="yellow"/>
           <w:lang w:val="en-US"/>
         </w:rPr>
         <w:t xml:space="preserve">   }</w:t>
@@ -1954,15 +2224,18 @@
     </w:p>
     <w:p>
       <w:pPr>
-        <w:rPr>
-          <w:lang w:val="en-US"/>
-        </w:rPr>
-      </w:pPr>
-      <w:r>
-        <w:rPr>
-          <w:rFonts w:ascii="Menlo" w:eastAsia="Menlo" w:hAnsi="Menlo" w:cs="Menlo"/>
-          <w:sz w:val="19"/>
-          <w:szCs w:val="19"/>
+        <w:spacing w:after="0"/>
+        <w:rPr>
+          <w:highlight w:val="yellow"/>
+          <w:lang w:val="en-US"/>
+        </w:rPr>
+      </w:pPr>
+      <w:r>
+        <w:rPr>
+          <w:rFonts w:ascii="Menlo" w:eastAsia="Menlo" w:hAnsi="Menlo" w:cs="Menlo"/>
+          <w:sz w:val="19"/>
+          <w:szCs w:val="19"/>
+          <w:highlight w:val="yellow"/>
           <w:lang w:val="en-US"/>
         </w:rPr>
         <w:t xml:space="preserve">    ,</w:t>
@@ -1970,15 +2243,18 @@
     </w:p>
     <w:p>
       <w:pPr>
-        <w:rPr>
-          <w:lang w:val="en-US"/>
-        </w:rPr>
-      </w:pPr>
-      <w:r>
-        <w:rPr>
-          <w:rFonts w:ascii="Menlo" w:eastAsia="Menlo" w:hAnsi="Menlo" w:cs="Menlo"/>
-          <w:sz w:val="19"/>
-          <w:szCs w:val="19"/>
+        <w:spacing w:after="0"/>
+        <w:rPr>
+          <w:highlight w:val="yellow"/>
+          <w:lang w:val="en-US"/>
+        </w:rPr>
+      </w:pPr>
+      <w:r>
+        <w:rPr>
+          <w:rFonts w:ascii="Menlo" w:eastAsia="Menlo" w:hAnsi="Menlo" w:cs="Menlo"/>
+          <w:sz w:val="19"/>
+          <w:szCs w:val="19"/>
+          <w:highlight w:val="yellow"/>
           <w:lang w:val="en-US"/>
         </w:rPr>
         <w:t xml:space="preserve">   {</w:t>
@@ -1986,15 +2262,18 @@
     </w:p>
     <w:p>
       <w:pPr>
-        <w:rPr>
-          <w:lang w:val="en-US"/>
-        </w:rPr>
-      </w:pPr>
-      <w:r>
-        <w:rPr>
-          <w:rFonts w:ascii="Menlo" w:eastAsia="Menlo" w:hAnsi="Menlo" w:cs="Menlo"/>
-          <w:sz w:val="19"/>
-          <w:szCs w:val="19"/>
+        <w:spacing w:after="0"/>
+        <w:rPr>
+          <w:highlight w:val="yellow"/>
+          <w:lang w:val="en-US"/>
+        </w:rPr>
+      </w:pPr>
+      <w:r>
+        <w:rPr>
+          <w:rFonts w:ascii="Menlo" w:eastAsia="Menlo" w:hAnsi="Menlo" w:cs="Menlo"/>
+          <w:sz w:val="19"/>
+          <w:szCs w:val="19"/>
+          <w:highlight w:val="yellow"/>
           <w:lang w:val="en-US"/>
         </w:rPr>
         <w:t xml:space="preserve">      $project: {</w:t>
@@ -2002,15 +2281,18 @@
     </w:p>
     <w:p>
       <w:pPr>
-        <w:rPr>
-          <w:lang w:val="en-US"/>
-        </w:rPr>
-      </w:pPr>
-      <w:r>
-        <w:rPr>
-          <w:rFonts w:ascii="Menlo" w:eastAsia="Menlo" w:hAnsi="Menlo" w:cs="Menlo"/>
-          <w:sz w:val="19"/>
-          <w:szCs w:val="19"/>
+        <w:spacing w:after="0"/>
+        <w:rPr>
+          <w:highlight w:val="yellow"/>
+          <w:lang w:val="en-US"/>
+        </w:rPr>
+      </w:pPr>
+      <w:r>
+        <w:rPr>
+          <w:rFonts w:ascii="Menlo" w:eastAsia="Menlo" w:hAnsi="Menlo" w:cs="Menlo"/>
+          <w:sz w:val="19"/>
+          <w:szCs w:val="19"/>
+          <w:highlight w:val="yellow"/>
           <w:lang w:val="en-US"/>
         </w:rPr>
         <w:t xml:space="preserve">          _id:0,</w:t>
@@ -2018,15 +2300,18 @@
     </w:p>
     <w:p>
       <w:pPr>
-        <w:rPr>
-          <w:lang w:val="en-US"/>
-        </w:rPr>
-      </w:pPr>
-      <w:r>
-        <w:rPr>
-          <w:rFonts w:ascii="Menlo" w:eastAsia="Menlo" w:hAnsi="Menlo" w:cs="Menlo"/>
-          <w:sz w:val="19"/>
-          <w:szCs w:val="19"/>
+        <w:spacing w:after="0"/>
+        <w:rPr>
+          <w:highlight w:val="yellow"/>
+          <w:lang w:val="en-US"/>
+        </w:rPr>
+      </w:pPr>
+      <w:r>
+        <w:rPr>
+          <w:rFonts w:ascii="Menlo" w:eastAsia="Menlo" w:hAnsi="Menlo" w:cs="Menlo"/>
+          <w:sz w:val="19"/>
+          <w:szCs w:val="19"/>
+          <w:highlight w:val="yellow"/>
           <w:lang w:val="en-US"/>
         </w:rPr>
         <w:t xml:space="preserve">          "tag":"$_</w:t>
@@ -2037,6 +2322,7 @@
           <w:rFonts w:ascii="Menlo" w:eastAsia="Menlo" w:hAnsi="Menlo" w:cs="Menlo"/>
           <w:sz w:val="19"/>
           <w:szCs w:val="19"/>
+          <w:highlight w:val="yellow"/>
           <w:lang w:val="en-US"/>
         </w:rPr>
         <w:t>id.tag</w:t>
@@ -2047,6 +2333,7 @@
           <w:rFonts w:ascii="Menlo" w:eastAsia="Menlo" w:hAnsi="Menlo" w:cs="Menlo"/>
           <w:sz w:val="19"/>
           <w:szCs w:val="19"/>
+          <w:highlight w:val="yellow"/>
           <w:lang w:val="en-US"/>
         </w:rPr>
         <w:t>",</w:t>
@@ -2054,15 +2341,18 @@
     </w:p>
     <w:p>
       <w:pPr>
-        <w:rPr>
-          <w:lang w:val="en-US"/>
-        </w:rPr>
-      </w:pPr>
-      <w:r>
-        <w:rPr>
-          <w:rFonts w:ascii="Menlo" w:eastAsia="Menlo" w:hAnsi="Menlo" w:cs="Menlo"/>
-          <w:sz w:val="19"/>
-          <w:szCs w:val="19"/>
+        <w:spacing w:after="0"/>
+        <w:rPr>
+          <w:highlight w:val="yellow"/>
+          <w:lang w:val="en-US"/>
+        </w:rPr>
+      </w:pPr>
+      <w:r>
+        <w:rPr>
+          <w:rFonts w:ascii="Menlo" w:eastAsia="Menlo" w:hAnsi="Menlo" w:cs="Menlo"/>
+          <w:sz w:val="19"/>
+          <w:szCs w:val="19"/>
+          <w:highlight w:val="yellow"/>
           <w:lang w:val="en-US"/>
         </w:rPr>
         <w:t xml:space="preserve">           "year":"$_</w:t>
@@ -2074,6 +2364,7 @@
           <w:rFonts w:ascii="Menlo" w:eastAsia="Menlo" w:hAnsi="Menlo" w:cs="Menlo"/>
           <w:sz w:val="19"/>
           <w:szCs w:val="19"/>
+          <w:highlight w:val="yellow"/>
           <w:lang w:val="en-US"/>
         </w:rPr>
         <w:t>id.year</w:t>
@@ -2085,6 +2376,7 @@
           <w:rFonts w:ascii="Menlo" w:eastAsia="Menlo" w:hAnsi="Menlo" w:cs="Menlo"/>
           <w:sz w:val="19"/>
           <w:szCs w:val="19"/>
+          <w:highlight w:val="yellow"/>
           <w:lang w:val="en-US"/>
         </w:rPr>
         <w:t>",</w:t>
@@ -2092,15 +2384,18 @@
     </w:p>
     <w:p>
       <w:pPr>
-        <w:rPr>
-          <w:lang w:val="en-US"/>
-        </w:rPr>
-      </w:pPr>
-      <w:r>
-        <w:rPr>
-          <w:rFonts w:ascii="Menlo" w:eastAsia="Menlo" w:hAnsi="Menlo" w:cs="Menlo"/>
-          <w:sz w:val="19"/>
-          <w:szCs w:val="19"/>
+        <w:spacing w:after="0"/>
+        <w:rPr>
+          <w:highlight w:val="yellow"/>
+          <w:lang w:val="en-US"/>
+        </w:rPr>
+      </w:pPr>
+      <w:r>
+        <w:rPr>
+          <w:rFonts w:ascii="Menlo" w:eastAsia="Menlo" w:hAnsi="Menlo" w:cs="Menlo"/>
+          <w:sz w:val="19"/>
+          <w:szCs w:val="19"/>
+          <w:highlight w:val="yellow"/>
           <w:lang w:val="en-US"/>
         </w:rPr>
         <w:t xml:space="preserve">           count:1</w:t>
@@ -2108,15 +2403,18 @@
     </w:p>
     <w:p>
       <w:pPr>
-        <w:rPr>
-          <w:lang w:val="en-US"/>
-        </w:rPr>
-      </w:pPr>
-      <w:r>
-        <w:rPr>
-          <w:rFonts w:ascii="Menlo" w:eastAsia="Menlo" w:hAnsi="Menlo" w:cs="Menlo"/>
-          <w:sz w:val="19"/>
-          <w:szCs w:val="19"/>
+        <w:spacing w:after="0"/>
+        <w:rPr>
+          <w:highlight w:val="yellow"/>
+          <w:lang w:val="en-US"/>
+        </w:rPr>
+      </w:pPr>
+      <w:r>
+        <w:rPr>
+          <w:rFonts w:ascii="Menlo" w:eastAsia="Menlo" w:hAnsi="Menlo" w:cs="Menlo"/>
+          <w:sz w:val="19"/>
+          <w:szCs w:val="19"/>
+          <w:highlight w:val="yellow"/>
           <w:lang w:val="en-US"/>
         </w:rPr>
         <w:t xml:space="preserve">       }</w:t>
@@ -2124,15 +2422,18 @@
     </w:p>
     <w:p>
       <w:pPr>
-        <w:rPr>
-          <w:lang w:val="en-US"/>
-        </w:rPr>
-      </w:pPr>
-      <w:r>
-        <w:rPr>
-          <w:rFonts w:ascii="Menlo" w:eastAsia="Menlo" w:hAnsi="Menlo" w:cs="Menlo"/>
-          <w:sz w:val="19"/>
-          <w:szCs w:val="19"/>
+        <w:spacing w:after="0"/>
+        <w:rPr>
+          <w:highlight w:val="yellow"/>
+          <w:lang w:val="en-US"/>
+        </w:rPr>
+      </w:pPr>
+      <w:r>
+        <w:rPr>
+          <w:rFonts w:ascii="Menlo" w:eastAsia="Menlo" w:hAnsi="Menlo" w:cs="Menlo"/>
+          <w:sz w:val="19"/>
+          <w:szCs w:val="19"/>
+          <w:highlight w:val="yellow"/>
           <w:lang w:val="en-US"/>
         </w:rPr>
         <w:t xml:space="preserve">   },</w:t>
@@ -2140,15 +2441,18 @@
     </w:p>
     <w:p>
       <w:pPr>
-        <w:rPr>
-          <w:lang w:val="en-US"/>
-        </w:rPr>
-      </w:pPr>
-      <w:r>
-        <w:rPr>
-          <w:rFonts w:ascii="Menlo" w:eastAsia="Menlo" w:hAnsi="Menlo" w:cs="Menlo"/>
-          <w:sz w:val="19"/>
-          <w:szCs w:val="19"/>
+        <w:spacing w:after="0"/>
+        <w:rPr>
+          <w:highlight w:val="yellow"/>
+          <w:lang w:val="en-US"/>
+        </w:rPr>
+      </w:pPr>
+      <w:r>
+        <w:rPr>
+          <w:rFonts w:ascii="Menlo" w:eastAsia="Menlo" w:hAnsi="Menlo" w:cs="Menlo"/>
+          <w:sz w:val="19"/>
+          <w:szCs w:val="19"/>
+          <w:highlight w:val="yellow"/>
           <w:lang w:val="en-US"/>
         </w:rPr>
         <w:t xml:space="preserve">    {</w:t>
@@ -2156,15 +2460,18 @@
     </w:p>
     <w:p>
       <w:pPr>
-        <w:rPr>
-          <w:lang w:val="en-US"/>
-        </w:rPr>
-      </w:pPr>
-      <w:r>
-        <w:rPr>
-          <w:rFonts w:ascii="Menlo" w:eastAsia="Menlo" w:hAnsi="Menlo" w:cs="Menlo"/>
-          <w:sz w:val="19"/>
-          <w:szCs w:val="19"/>
+        <w:spacing w:after="0"/>
+        <w:rPr>
+          <w:highlight w:val="yellow"/>
+          <w:lang w:val="en-US"/>
+        </w:rPr>
+      </w:pPr>
+      <w:r>
+        <w:rPr>
+          <w:rFonts w:ascii="Menlo" w:eastAsia="Menlo" w:hAnsi="Menlo" w:cs="Menlo"/>
+          <w:sz w:val="19"/>
+          <w:szCs w:val="19"/>
+          <w:highlight w:val="yellow"/>
           <w:lang w:val="en-US"/>
         </w:rPr>
         <w:t xml:space="preserve">       $</w:t>
@@ -2175,6 +2482,7 @@
           <w:rFonts w:ascii="Menlo" w:eastAsia="Menlo" w:hAnsi="Menlo" w:cs="Menlo"/>
           <w:sz w:val="19"/>
           <w:szCs w:val="19"/>
+          <w:highlight w:val="yellow"/>
           <w:lang w:val="en-US"/>
         </w:rPr>
         <w:t>sort :</w:t>
@@ -2185,17 +2493,25 @@
           <w:rFonts w:ascii="Menlo" w:eastAsia="Menlo" w:hAnsi="Menlo" w:cs="Menlo"/>
           <w:sz w:val="19"/>
           <w:szCs w:val="19"/>
+          <w:highlight w:val="yellow"/>
           <w:lang w:val="en-US"/>
         </w:rPr>
         <w:t xml:space="preserve"> { "year" : -1,"count": -1 }</w:t>
       </w:r>
     </w:p>
     <w:p>
-      <w:r>
-        <w:rPr>
-          <w:rFonts w:ascii="Menlo" w:eastAsia="Menlo" w:hAnsi="Menlo" w:cs="Menlo"/>
-          <w:sz w:val="19"/>
-          <w:szCs w:val="19"/>
+      <w:pPr>
+        <w:spacing w:after="0"/>
+        <w:rPr>
+          <w:highlight w:val="yellow"/>
+        </w:rPr>
+      </w:pPr>
+      <w:r>
+        <w:rPr>
+          <w:rFonts w:ascii="Menlo" w:eastAsia="Menlo" w:hAnsi="Menlo" w:cs="Menlo"/>
+          <w:sz w:val="19"/>
+          <w:szCs w:val="19"/>
+          <w:highlight w:val="yellow"/>
           <w:lang w:val="en-US"/>
         </w:rPr>
         <w:t xml:space="preserve">   </w:t>
@@ -2205,16 +2521,21 @@
           <w:rFonts w:ascii="Menlo" w:eastAsia="Menlo" w:hAnsi="Menlo" w:cs="Menlo"/>
           <w:sz w:val="19"/>
           <w:szCs w:val="19"/>
+          <w:highlight w:val="yellow"/>
         </w:rPr>
         <w:t>}</w:t>
       </w:r>
     </w:p>
     <w:p>
-      <w:r>
-        <w:rPr>
-          <w:rFonts w:ascii="Menlo" w:eastAsia="Menlo" w:hAnsi="Menlo" w:cs="Menlo"/>
-          <w:sz w:val="19"/>
-          <w:szCs w:val="19"/>
+      <w:pPr>
+        <w:spacing w:after="0"/>
+      </w:pPr>
+      <w:r>
+        <w:rPr>
+          <w:rFonts w:ascii="Menlo" w:eastAsia="Menlo" w:hAnsi="Menlo" w:cs="Menlo"/>
+          <w:sz w:val="19"/>
+          <w:szCs w:val="19"/>
+          <w:highlight w:val="yellow"/>
         </w:rPr>
         <w:t>] )</w:t>
       </w:r>
@@ -2365,35 +2686,20 @@
           <w:szCs w:val="19"/>
         </w:rPr>
       </w:pPr>
+      <w:r>
+        <w:t xml:space="preserve">Multiple Filtering </w:t>
+      </w:r>
       <w:proofErr w:type="spellStart"/>
       <w:r>
-        <w:rPr>
-          <w:rFonts w:ascii="Menlo" w:eastAsia="Menlo" w:hAnsi="Menlo" w:cs="Menlo"/>
-          <w:color w:val="000000" w:themeColor="text1"/>
-          <w:sz w:val="19"/>
-          <w:szCs w:val="19"/>
-        </w:rPr>
-        <w:t>Condition</w:t>
+        <w:t>conditions</w:t>
       </w:r>
       <w:proofErr w:type="spellEnd"/>
       <w:r>
-        <w:rPr>
-          <w:rFonts w:ascii="Menlo" w:eastAsia="Menlo" w:hAnsi="Menlo" w:cs="Menlo"/>
-          <w:color w:val="000000" w:themeColor="text1"/>
-          <w:sz w:val="19"/>
-          <w:szCs w:val="19"/>
-        </w:rPr>
         <w:t xml:space="preserve">, </w:t>
       </w:r>
       <w:proofErr w:type="spellStart"/>
       <w:r>
-        <w:rPr>
-          <w:rFonts w:ascii="Menlo" w:eastAsia="Menlo" w:hAnsi="Menlo" w:cs="Menlo"/>
-          <w:color w:val="000000" w:themeColor="text1"/>
-          <w:sz w:val="19"/>
-          <w:szCs w:val="19"/>
-        </w:rPr>
-        <w:t>Aggregation</w:t>
+        <w:t>aggregation</w:t>
       </w:r>
       <w:proofErr w:type="spellEnd"/>
     </w:p>
@@ -4562,6 +4868,37 @@
                 <w:lang w:val="en-US"/>
               </w:rPr>
               <w:t xml:space="preserve"> sections with size 2 . The results that are returned are 4 and are sorted in descending order.</w:t>
+            </w:r>
+          </w:p>
+          <w:p>
+            <w:pPr>
+              <w:spacing w:line="360" w:lineRule="exact"/>
+              <w:rPr>
+                <w:lang w:val="en-US"/>
+              </w:rPr>
+            </w:pPr>
+            <w:r>
+              <w:rPr>
+                <w:rFonts w:ascii="Calibri" w:eastAsia="Calibri" w:hAnsi="Calibri" w:cs="Calibri"/>
+                <w:lang w:val="en-US"/>
+              </w:rPr>
+              <w:t xml:space="preserve">Multiple Filtering conditions (also on internal </w:t>
+            </w:r>
+            <w:proofErr w:type="spellStart"/>
+            <w:r>
+              <w:rPr>
+                <w:rFonts w:ascii="Calibri" w:eastAsia="Calibri" w:hAnsi="Calibri" w:cs="Calibri"/>
+                <w:lang w:val="en-US"/>
+              </w:rPr>
+              <w:t>subdocs</w:t>
+            </w:r>
+            <w:proofErr w:type="spellEnd"/>
+            <w:r>
+              <w:rPr>
+                <w:rFonts w:ascii="Calibri" w:eastAsia="Calibri" w:hAnsi="Calibri" w:cs="Calibri"/>
+                <w:lang w:val="en-US"/>
+              </w:rPr>
+              <w:t>)</w:t>
             </w:r>
           </w:p>
           <w:p>
@@ -5970,13 +6307,1224 @@
           <w:color w:val="000000" w:themeColor="text1"/>
           <w:sz w:val="19"/>
           <w:szCs w:val="19"/>
-        </w:rPr>
-      </w:pPr>
-    </w:p>
-    <w:p>
-      <w:pPr>
-        <w:rPr>
-          <w:rFonts w:ascii="Menlo" w:eastAsia="Menlo" w:hAnsi="Menlo" w:cs="Menlo"/>
+          <w:lang w:val="en-US"/>
+        </w:rPr>
+      </w:pPr>
+      <w:r>
+        <w:rPr>
+          <w:rFonts w:ascii="Consolas" w:eastAsia="Consolas" w:hAnsi="Consolas" w:cs="Consolas"/>
+          <w:color w:val="000000" w:themeColor="text1"/>
+          <w:sz w:val="19"/>
+          <w:szCs w:val="19"/>
+          <w:lang w:val="en-US"/>
+        </w:rPr>
+        <w:t xml:space="preserve">3)This query returns the articles that have at least one document of their </w:t>
+      </w:r>
+      <w:proofErr w:type="gramStart"/>
+      <w:r>
+        <w:rPr>
+          <w:rFonts w:ascii="Consolas" w:eastAsia="Consolas" w:hAnsi="Consolas" w:cs="Consolas"/>
+          <w:color w:val="000000" w:themeColor="text1"/>
+          <w:sz w:val="19"/>
+          <w:szCs w:val="19"/>
+          <w:lang w:val="en-US"/>
+        </w:rPr>
+        <w:t>bibliography  published</w:t>
+      </w:r>
+      <w:proofErr w:type="gramEnd"/>
+      <w:r>
+        <w:rPr>
+          <w:rFonts w:ascii="Consolas" w:eastAsia="Consolas" w:hAnsi="Consolas" w:cs="Consolas"/>
+          <w:color w:val="000000" w:themeColor="text1"/>
+          <w:sz w:val="19"/>
+          <w:szCs w:val="19"/>
+          <w:lang w:val="en-US"/>
+        </w:rPr>
+        <w:t xml:space="preserve"> after 2018(included) and that one of the authors is affiliated to </w:t>
+      </w:r>
+      <w:proofErr w:type="spellStart"/>
+      <w:r>
+        <w:rPr>
+          <w:rFonts w:ascii="Consolas" w:eastAsia="Consolas" w:hAnsi="Consolas" w:cs="Consolas"/>
+          <w:color w:val="000000" w:themeColor="text1"/>
+          <w:sz w:val="19"/>
+          <w:szCs w:val="19"/>
+          <w:lang w:val="en-US"/>
+        </w:rPr>
+        <w:t>Universidade</w:t>
+      </w:r>
+      <w:proofErr w:type="spellEnd"/>
+      <w:r>
+        <w:rPr>
+          <w:rFonts w:ascii="Consolas" w:eastAsia="Consolas" w:hAnsi="Consolas" w:cs="Consolas"/>
+          <w:color w:val="000000" w:themeColor="text1"/>
+          <w:sz w:val="19"/>
+          <w:szCs w:val="19"/>
+          <w:lang w:val="en-US"/>
+        </w:rPr>
+        <w:t xml:space="preserve"> do Estado do Rio de Janeiro.</w:t>
+      </w:r>
+    </w:p>
+    <w:p>
+      <w:pPr>
+        <w:rPr>
+          <w:rFonts w:ascii="Consolas" w:eastAsia="Consolas" w:hAnsi="Consolas" w:cs="Consolas"/>
+          <w:sz w:val="19"/>
+          <w:szCs w:val="19"/>
+          <w:lang w:val="en-US"/>
+        </w:rPr>
+      </w:pPr>
+      <w:r>
+        <w:rPr>
+          <w:rFonts w:ascii="Consolas" w:eastAsia="Consolas" w:hAnsi="Consolas" w:cs="Consolas"/>
+          <w:sz w:val="19"/>
+          <w:szCs w:val="19"/>
+          <w:lang w:val="en-US"/>
+        </w:rPr>
+        <w:t xml:space="preserve"> Multiple Filtering through refs, aggregation, also on internal </w:t>
+      </w:r>
+      <w:proofErr w:type="spellStart"/>
+      <w:r>
+        <w:rPr>
+          <w:rFonts w:ascii="Consolas" w:eastAsia="Consolas" w:hAnsi="Consolas" w:cs="Consolas"/>
+          <w:sz w:val="19"/>
+          <w:szCs w:val="19"/>
+          <w:lang w:val="en-US"/>
+        </w:rPr>
+        <w:t>subdocs</w:t>
+      </w:r>
+      <w:proofErr w:type="spellEnd"/>
+    </w:p>
+    <w:p>
+      <w:pPr>
+        <w:rPr>
+          <w:rFonts w:ascii="Consolas" w:eastAsia="Consolas" w:hAnsi="Consolas" w:cs="Consolas"/>
+          <w:color w:val="000000" w:themeColor="text1"/>
+          <w:sz w:val="19"/>
+          <w:szCs w:val="19"/>
+          <w:lang w:val="en-US"/>
+        </w:rPr>
+      </w:pPr>
+      <w:r>
+        <w:rPr>
+          <w:rFonts w:ascii="Consolas" w:eastAsia="Consolas" w:hAnsi="Consolas" w:cs="Consolas"/>
+          <w:color w:val="F9FBFA"/>
+          <w:sz w:val="19"/>
+          <w:szCs w:val="19"/>
+          <w:lang w:val="en-US"/>
+        </w:rPr>
+        <w:t xml:space="preserve"> </w:t>
+      </w:r>
+      <w:proofErr w:type="spellStart"/>
+      <w:r>
+        <w:rPr>
+          <w:rFonts w:ascii="Consolas" w:eastAsia="Consolas" w:hAnsi="Consolas" w:cs="Consolas"/>
+          <w:color w:val="000000" w:themeColor="text1"/>
+          <w:sz w:val="19"/>
+          <w:szCs w:val="19"/>
+          <w:lang w:val="en-US"/>
+        </w:rPr>
+        <w:t>db.articles.aggregate</w:t>
+      </w:r>
+      <w:proofErr w:type="spellEnd"/>
+      <w:r>
+        <w:rPr>
+          <w:rFonts w:ascii="Consolas" w:eastAsia="Consolas" w:hAnsi="Consolas" w:cs="Consolas"/>
+          <w:color w:val="000000" w:themeColor="text1"/>
+          <w:sz w:val="19"/>
+          <w:szCs w:val="19"/>
+          <w:lang w:val="en-US"/>
+        </w:rPr>
+        <w:t>([{"$match":{"bibliography": {"$exists" : true }}}, {"$lookup":{</w:t>
+      </w:r>
+      <w:proofErr w:type="spellStart"/>
+      <w:r>
+        <w:rPr>
+          <w:rFonts w:ascii="Consolas" w:eastAsia="Consolas" w:hAnsi="Consolas" w:cs="Consolas"/>
+          <w:color w:val="000000" w:themeColor="text1"/>
+          <w:sz w:val="19"/>
+          <w:szCs w:val="19"/>
+          <w:lang w:val="en-US"/>
+        </w:rPr>
+        <w:t>from:"authors</w:t>
+      </w:r>
+      <w:proofErr w:type="spellEnd"/>
+      <w:r>
+        <w:rPr>
+          <w:rFonts w:ascii="Consolas" w:eastAsia="Consolas" w:hAnsi="Consolas" w:cs="Consolas"/>
+          <w:color w:val="000000" w:themeColor="text1"/>
+          <w:sz w:val="19"/>
+          <w:szCs w:val="19"/>
+          <w:lang w:val="en-US"/>
+        </w:rPr>
+        <w:t>",</w:t>
+      </w:r>
+      <w:r>
+        <w:rPr>
+          <w:lang w:val="en-US"/>
+        </w:rPr>
+        <w:br/>
+      </w:r>
+      <w:proofErr w:type="spellStart"/>
+      <w:r>
+        <w:rPr>
+          <w:rFonts w:ascii="Consolas" w:eastAsia="Consolas" w:hAnsi="Consolas" w:cs="Consolas"/>
+          <w:color w:val="000000" w:themeColor="text1"/>
+          <w:sz w:val="19"/>
+          <w:szCs w:val="19"/>
+          <w:lang w:val="en-US"/>
+        </w:rPr>
+        <w:t>localField</w:t>
+      </w:r>
+      <w:proofErr w:type="spellEnd"/>
+      <w:r>
+        <w:rPr>
+          <w:rFonts w:ascii="Consolas" w:eastAsia="Consolas" w:hAnsi="Consolas" w:cs="Consolas"/>
+          <w:color w:val="000000" w:themeColor="text1"/>
+          <w:sz w:val="19"/>
+          <w:szCs w:val="19"/>
+          <w:lang w:val="en-US"/>
+        </w:rPr>
+        <w:t>:"authors.id",</w:t>
+      </w:r>
+      <w:r>
+        <w:rPr>
+          <w:lang w:val="en-US"/>
+        </w:rPr>
+        <w:br/>
+      </w:r>
+      <w:proofErr w:type="spellStart"/>
+      <w:r>
+        <w:rPr>
+          <w:rFonts w:ascii="Consolas" w:eastAsia="Consolas" w:hAnsi="Consolas" w:cs="Consolas"/>
+          <w:color w:val="000000" w:themeColor="text1"/>
+          <w:sz w:val="19"/>
+          <w:szCs w:val="19"/>
+          <w:lang w:val="en-US"/>
+        </w:rPr>
+        <w:t>foreignField</w:t>
+      </w:r>
+      <w:proofErr w:type="spellEnd"/>
+      <w:r>
+        <w:rPr>
+          <w:rFonts w:ascii="Consolas" w:eastAsia="Consolas" w:hAnsi="Consolas" w:cs="Consolas"/>
+          <w:color w:val="000000" w:themeColor="text1"/>
+          <w:sz w:val="19"/>
+          <w:szCs w:val="19"/>
+          <w:lang w:val="en-US"/>
+        </w:rPr>
+        <w:t>:"</w:t>
+      </w:r>
+      <w:proofErr w:type="spellStart"/>
+      <w:r>
+        <w:rPr>
+          <w:rFonts w:ascii="Consolas" w:eastAsia="Consolas" w:hAnsi="Consolas" w:cs="Consolas"/>
+          <w:color w:val="000000" w:themeColor="text1"/>
+          <w:sz w:val="19"/>
+          <w:szCs w:val="19"/>
+          <w:lang w:val="en-US"/>
+        </w:rPr>
+        <w:t>author_id</w:t>
+      </w:r>
+      <w:proofErr w:type="spellEnd"/>
+      <w:r>
+        <w:rPr>
+          <w:rFonts w:ascii="Consolas" w:eastAsia="Consolas" w:hAnsi="Consolas" w:cs="Consolas"/>
+          <w:color w:val="000000" w:themeColor="text1"/>
+          <w:sz w:val="19"/>
+          <w:szCs w:val="19"/>
+          <w:lang w:val="en-US"/>
+        </w:rPr>
+        <w:t>",</w:t>
+      </w:r>
+      <w:r>
+        <w:rPr>
+          <w:lang w:val="en-US"/>
+        </w:rPr>
+        <w:br/>
+      </w:r>
+      <w:r>
+        <w:rPr>
+          <w:rFonts w:ascii="Consolas" w:eastAsia="Consolas" w:hAnsi="Consolas" w:cs="Consolas"/>
+          <w:color w:val="000000" w:themeColor="text1"/>
+          <w:sz w:val="19"/>
+          <w:szCs w:val="19"/>
+          <w:lang w:val="en-US"/>
+        </w:rPr>
+        <w:t>as:"</w:t>
+      </w:r>
+      <w:proofErr w:type="spellStart"/>
+      <w:r>
+        <w:rPr>
+          <w:rFonts w:ascii="Consolas" w:eastAsia="Consolas" w:hAnsi="Consolas" w:cs="Consolas"/>
+          <w:color w:val="000000" w:themeColor="text1"/>
+          <w:sz w:val="19"/>
+          <w:szCs w:val="19"/>
+          <w:lang w:val="en-US"/>
+        </w:rPr>
+        <w:t>authorsDetailed</w:t>
+      </w:r>
+      <w:proofErr w:type="spellEnd"/>
+      <w:r>
+        <w:rPr>
+          <w:rFonts w:ascii="Consolas" w:eastAsia="Consolas" w:hAnsi="Consolas" w:cs="Consolas"/>
+          <w:color w:val="000000" w:themeColor="text1"/>
+          <w:sz w:val="19"/>
+          <w:szCs w:val="19"/>
+          <w:lang w:val="en-US"/>
+        </w:rPr>
+        <w:t>"}},{"$match":{"</w:t>
+      </w:r>
+      <w:proofErr w:type="spellStart"/>
+      <w:r>
+        <w:rPr>
+          <w:rFonts w:ascii="Consolas" w:eastAsia="Consolas" w:hAnsi="Consolas" w:cs="Consolas"/>
+          <w:color w:val="000000" w:themeColor="text1"/>
+          <w:sz w:val="19"/>
+          <w:szCs w:val="19"/>
+          <w:lang w:val="en-US"/>
+        </w:rPr>
+        <w:t>bibliography.date</w:t>
+      </w:r>
+      <w:proofErr w:type="spellEnd"/>
+      <w:r>
+        <w:rPr>
+          <w:rFonts w:ascii="Consolas" w:eastAsia="Consolas" w:hAnsi="Consolas" w:cs="Consolas"/>
+          <w:color w:val="000000" w:themeColor="text1"/>
+          <w:sz w:val="19"/>
+          <w:szCs w:val="19"/>
+          <w:lang w:val="en-US"/>
+        </w:rPr>
+        <w:t>": {"$</w:t>
+      </w:r>
+      <w:proofErr w:type="spellStart"/>
+      <w:r>
+        <w:rPr>
+          <w:rFonts w:ascii="Consolas" w:eastAsia="Consolas" w:hAnsi="Consolas" w:cs="Consolas"/>
+          <w:color w:val="000000" w:themeColor="text1"/>
+          <w:sz w:val="19"/>
+          <w:szCs w:val="19"/>
+          <w:lang w:val="en-US"/>
+        </w:rPr>
+        <w:t>gte</w:t>
+      </w:r>
+      <w:proofErr w:type="spellEnd"/>
+      <w:r>
+        <w:rPr>
+          <w:rFonts w:ascii="Consolas" w:eastAsia="Consolas" w:hAnsi="Consolas" w:cs="Consolas"/>
+          <w:color w:val="000000" w:themeColor="text1"/>
+          <w:sz w:val="19"/>
+          <w:szCs w:val="19"/>
+          <w:lang w:val="en-US"/>
+        </w:rPr>
+        <w:t>" : ISODate('2018-01-01')},"authorsDetailed.affiliation":"Universidade do Estado do Rio de Janeiro"}},</w:t>
+      </w:r>
+      <w:r>
+        <w:rPr>
+          <w:lang w:val="en-US"/>
+        </w:rPr>
+        <w:br/>
+      </w:r>
+      <w:r>
+        <w:rPr>
+          <w:rFonts w:ascii="Consolas" w:eastAsia="Consolas" w:hAnsi="Consolas" w:cs="Consolas"/>
+          <w:color w:val="000000" w:themeColor="text1"/>
+          <w:sz w:val="19"/>
+          <w:szCs w:val="19"/>
+          <w:lang w:val="en-US"/>
+        </w:rPr>
+        <w:t>{"$project":{ "title":1,"bibliography.date":1, "</w:t>
+      </w:r>
+      <w:proofErr w:type="spellStart"/>
+      <w:r>
+        <w:rPr>
+          <w:rFonts w:ascii="Consolas" w:eastAsia="Consolas" w:hAnsi="Consolas" w:cs="Consolas"/>
+          <w:color w:val="000000" w:themeColor="text1"/>
+          <w:sz w:val="19"/>
+          <w:szCs w:val="19"/>
+          <w:lang w:val="en-US"/>
+        </w:rPr>
+        <w:t>authorsDetailed.affiliation</w:t>
+      </w:r>
+      <w:proofErr w:type="spellEnd"/>
+      <w:r>
+        <w:rPr>
+          <w:rFonts w:ascii="Consolas" w:eastAsia="Consolas" w:hAnsi="Consolas" w:cs="Consolas"/>
+          <w:color w:val="000000" w:themeColor="text1"/>
+          <w:sz w:val="19"/>
+          <w:szCs w:val="19"/>
+          <w:lang w:val="en-US"/>
+        </w:rPr>
+        <w:t>": 1}}</w:t>
+      </w:r>
+      <w:r>
+        <w:rPr>
+          <w:lang w:val="en-US"/>
+        </w:rPr>
+        <w:br/>
+      </w:r>
+      <w:r>
+        <w:rPr>
+          <w:rFonts w:ascii="Consolas" w:eastAsia="Consolas" w:hAnsi="Consolas" w:cs="Consolas"/>
+          <w:color w:val="000000" w:themeColor="text1"/>
+          <w:sz w:val="19"/>
+          <w:szCs w:val="19"/>
+          <w:lang w:val="en-US"/>
+        </w:rPr>
+        <w:t>])</w:t>
+      </w:r>
+    </w:p>
+    <w:tbl>
+      <w:tblPr>
+        <w:tblStyle w:val="TableGrid"/>
+        <w:tblW w:w="0" w:type="auto"/>
+        <w:tblBorders>
+          <w:top w:val="single" w:sz="0" w:space="0" w:color="auto"/>
+          <w:left w:val="single" w:sz="0" w:space="0" w:color="auto"/>
+          <w:bottom w:val="single" w:sz="0" w:space="0" w:color="auto"/>
+          <w:right w:val="single" w:sz="0" w:space="0" w:color="auto"/>
+        </w:tblBorders>
+        <w:tblLayout w:type="fixed"/>
+        <w:tblLook w:val="06A0" w:firstRow="1" w:lastRow="0" w:firstColumn="1" w:lastColumn="0" w:noHBand="1" w:noVBand="1"/>
+      </w:tblPr>
+      <w:tblGrid>
+        <w:gridCol w:w="9630"/>
+      </w:tblGrid>
+      <w:tr>
+        <w:trPr>
+          <w:trHeight w:val="300"/>
+        </w:trPr>
+        <w:tc>
+          <w:tcPr>
+            <w:tcW w:w="9630" w:type="dxa"/>
+            <w:tcBorders>
+              <w:top w:val="single" w:sz="0" w:space="0" w:color="auto"/>
+              <w:left w:val="single" w:sz="0" w:space="0" w:color="auto"/>
+              <w:bottom w:val="single" w:sz="0" w:space="0" w:color="auto"/>
+              <w:right w:val="single" w:sz="0" w:space="0" w:color="auto"/>
+            </w:tcBorders>
+          </w:tcPr>
+          <w:p>
+            <w:pPr>
+              <w:rPr>
+                <w:color w:val="000000" w:themeColor="text1"/>
+                <w:sz w:val="19"/>
+                <w:szCs w:val="19"/>
+                <w:lang w:val="en-US"/>
+              </w:rPr>
+            </w:pPr>
+            <w:proofErr w:type="gramStart"/>
+            <w:r>
+              <w:rPr>
+                <w:color w:val="000000" w:themeColor="text1"/>
+                <w:sz w:val="19"/>
+                <w:szCs w:val="19"/>
+                <w:lang w:val="en-US"/>
+              </w:rPr>
+              <w:t>{ _</w:t>
+            </w:r>
+            <w:proofErr w:type="gramEnd"/>
+            <w:r>
+              <w:rPr>
+                <w:color w:val="000000" w:themeColor="text1"/>
+                <w:sz w:val="19"/>
+                <w:szCs w:val="19"/>
+                <w:lang w:val="en-US"/>
+              </w:rPr>
+              <w:t xml:space="preserve">id: </w:t>
+            </w:r>
+            <w:proofErr w:type="spellStart"/>
+            <w:r>
+              <w:rPr>
+                <w:color w:val="000000" w:themeColor="text1"/>
+                <w:sz w:val="19"/>
+                <w:szCs w:val="19"/>
+                <w:lang w:val="en-US"/>
+              </w:rPr>
+              <w:t>ObjectId</w:t>
+            </w:r>
+            <w:proofErr w:type="spellEnd"/>
+            <w:r>
+              <w:rPr>
+                <w:color w:val="000000" w:themeColor="text1"/>
+                <w:sz w:val="19"/>
+                <w:szCs w:val="19"/>
+                <w:lang w:val="en-US"/>
+              </w:rPr>
+              <w:t>("63727cd017e0d1dfd9c10ef6"),</w:t>
+            </w:r>
+          </w:p>
+          <w:p>
+            <w:pPr>
+              <w:rPr>
+                <w:lang w:val="en-US"/>
+              </w:rPr>
+            </w:pPr>
+            <w:r>
+              <w:rPr>
+                <w:color w:val="000000" w:themeColor="text1"/>
+                <w:sz w:val="19"/>
+                <w:szCs w:val="19"/>
+                <w:lang w:val="en-US"/>
+              </w:rPr>
+              <w:t xml:space="preserve">title: 'Numerical Solution of a </w:t>
+            </w:r>
+            <w:proofErr w:type="spellStart"/>
+            <w:r>
+              <w:rPr>
+                <w:color w:val="000000" w:themeColor="text1"/>
+                <w:sz w:val="19"/>
+                <w:szCs w:val="19"/>
+                <w:lang w:val="en-US"/>
+              </w:rPr>
+              <w:t>Semilinear</w:t>
+            </w:r>
+            <w:proofErr w:type="spellEnd"/>
+            <w:r>
+              <w:rPr>
+                <w:color w:val="000000" w:themeColor="text1"/>
+                <w:sz w:val="19"/>
+                <w:szCs w:val="19"/>
+                <w:lang w:val="en-US"/>
+              </w:rPr>
+              <w:t xml:space="preserve"> Parabolic Control Problem',</w:t>
+            </w:r>
+          </w:p>
+          <w:p>
+            <w:pPr>
+              <w:rPr>
+                <w:lang w:val="en-US"/>
+              </w:rPr>
+            </w:pPr>
+            <w:r>
+              <w:rPr>
+                <w:color w:val="000000" w:themeColor="text1"/>
+                <w:sz w:val="19"/>
+                <w:szCs w:val="19"/>
+                <w:lang w:val="en-US"/>
+              </w:rPr>
+              <w:t xml:space="preserve">bibliography: </w:t>
+            </w:r>
+          </w:p>
+          <w:p>
+            <w:pPr>
+              <w:rPr>
+                <w:lang w:val="en-US"/>
+              </w:rPr>
+            </w:pPr>
+            <w:r>
+              <w:rPr>
+                <w:color w:val="000000" w:themeColor="text1"/>
+                <w:sz w:val="19"/>
+                <w:szCs w:val="19"/>
+                <w:lang w:val="en-US"/>
+              </w:rPr>
+              <w:t xml:space="preserve">[ </w:t>
+            </w:r>
+            <w:proofErr w:type="gramStart"/>
+            <w:r>
+              <w:rPr>
+                <w:color w:val="000000" w:themeColor="text1"/>
+                <w:sz w:val="19"/>
+                <w:szCs w:val="19"/>
+                <w:lang w:val="en-US"/>
+              </w:rPr>
+              <w:t>{ date</w:t>
+            </w:r>
+            <w:proofErr w:type="gramEnd"/>
+            <w:r>
+              <w:rPr>
+                <w:color w:val="000000" w:themeColor="text1"/>
+                <w:sz w:val="19"/>
+                <w:szCs w:val="19"/>
+                <w:lang w:val="en-US"/>
+              </w:rPr>
+              <w:t>: 2008-07-29T20:20:08.000Z },</w:t>
+            </w:r>
+          </w:p>
+          <w:p>
+            <w:pPr>
+              <w:rPr>
+                <w:lang w:val="en-US"/>
+              </w:rPr>
+            </w:pPr>
+            <w:proofErr w:type="gramStart"/>
+            <w:r>
+              <w:rPr>
+                <w:color w:val="000000" w:themeColor="text1"/>
+                <w:sz w:val="19"/>
+                <w:szCs w:val="19"/>
+                <w:lang w:val="en-US"/>
+              </w:rPr>
+              <w:t>{ date</w:t>
+            </w:r>
+            <w:proofErr w:type="gramEnd"/>
+            <w:r>
+              <w:rPr>
+                <w:color w:val="000000" w:themeColor="text1"/>
+                <w:sz w:val="19"/>
+                <w:szCs w:val="19"/>
+                <w:lang w:val="en-US"/>
+              </w:rPr>
+              <w:t>: 2021-02-10T23:37:46.000Z },</w:t>
+            </w:r>
+          </w:p>
+          <w:p>
+            <w:pPr>
+              <w:rPr>
+                <w:lang w:val="en-US"/>
+              </w:rPr>
+            </w:pPr>
+            <w:proofErr w:type="gramStart"/>
+            <w:r>
+              <w:rPr>
+                <w:color w:val="000000" w:themeColor="text1"/>
+                <w:sz w:val="19"/>
+                <w:szCs w:val="19"/>
+                <w:lang w:val="en-US"/>
+              </w:rPr>
+              <w:t>{ date</w:t>
+            </w:r>
+            <w:proofErr w:type="gramEnd"/>
+            <w:r>
+              <w:rPr>
+                <w:color w:val="000000" w:themeColor="text1"/>
+                <w:sz w:val="19"/>
+                <w:szCs w:val="19"/>
+                <w:lang w:val="en-US"/>
+              </w:rPr>
+              <w:t>: 2013-09-11T16:02:31.000Z } ],</w:t>
+            </w:r>
+          </w:p>
+          <w:p>
+            <w:pPr>
+              <w:rPr>
+                <w:lang w:val="en-US"/>
+              </w:rPr>
+            </w:pPr>
+            <w:proofErr w:type="spellStart"/>
+            <w:r>
+              <w:rPr>
+                <w:color w:val="000000" w:themeColor="text1"/>
+                <w:sz w:val="19"/>
+                <w:szCs w:val="19"/>
+                <w:lang w:val="en-US"/>
+              </w:rPr>
+              <w:t>authorsDetailed</w:t>
+            </w:r>
+            <w:proofErr w:type="spellEnd"/>
+            <w:r>
+              <w:rPr>
+                <w:color w:val="000000" w:themeColor="text1"/>
+                <w:sz w:val="19"/>
+                <w:szCs w:val="19"/>
+                <w:lang w:val="en-US"/>
+              </w:rPr>
+              <w:t xml:space="preserve">: </w:t>
+            </w:r>
+          </w:p>
+          <w:p>
+            <w:pPr>
+              <w:rPr>
+                <w:lang w:val="en-US"/>
+              </w:rPr>
+            </w:pPr>
+            <w:r>
+              <w:rPr>
+                <w:color w:val="000000" w:themeColor="text1"/>
+                <w:sz w:val="19"/>
+                <w:szCs w:val="19"/>
+                <w:lang w:val="en-US"/>
+              </w:rPr>
+              <w:t xml:space="preserve">[ </w:t>
+            </w:r>
+            <w:proofErr w:type="gramStart"/>
+            <w:r>
+              <w:rPr>
+                <w:color w:val="000000" w:themeColor="text1"/>
+                <w:sz w:val="19"/>
+                <w:szCs w:val="19"/>
+                <w:lang w:val="en-US"/>
+              </w:rPr>
+              <w:t>{ affiliation</w:t>
+            </w:r>
+            <w:proofErr w:type="gramEnd"/>
+            <w:r>
+              <w:rPr>
+                <w:color w:val="000000" w:themeColor="text1"/>
+                <w:sz w:val="19"/>
+                <w:szCs w:val="19"/>
+                <w:lang w:val="en-US"/>
+              </w:rPr>
+              <w:t>: '</w:t>
+            </w:r>
+            <w:proofErr w:type="spellStart"/>
+            <w:r>
+              <w:rPr>
+                <w:color w:val="000000" w:themeColor="text1"/>
+                <w:sz w:val="19"/>
+                <w:szCs w:val="19"/>
+                <w:lang w:val="en-US"/>
+              </w:rPr>
+              <w:t>Faculté</w:t>
+            </w:r>
+            <w:proofErr w:type="spellEnd"/>
+            <w:r>
+              <w:rPr>
+                <w:color w:val="000000" w:themeColor="text1"/>
+                <w:sz w:val="19"/>
+                <w:szCs w:val="19"/>
+                <w:lang w:val="en-US"/>
+              </w:rPr>
+              <w:t xml:space="preserve"> Polytechnique de Mons' },</w:t>
+            </w:r>
+          </w:p>
+          <w:p>
+            <w:proofErr w:type="gramStart"/>
+            <w:r>
+              <w:rPr>
+                <w:color w:val="000000" w:themeColor="text1"/>
+                <w:sz w:val="19"/>
+                <w:szCs w:val="19"/>
+              </w:rPr>
+              <w:t xml:space="preserve">{ </w:t>
+            </w:r>
+            <w:proofErr w:type="spellStart"/>
+            <w:r>
+              <w:rPr>
+                <w:color w:val="000000" w:themeColor="text1"/>
+                <w:sz w:val="19"/>
+                <w:szCs w:val="19"/>
+              </w:rPr>
+              <w:t>affiliation</w:t>
+            </w:r>
+            <w:proofErr w:type="spellEnd"/>
+            <w:proofErr w:type="gramEnd"/>
+            <w:r>
+              <w:rPr>
+                <w:color w:val="000000" w:themeColor="text1"/>
+                <w:sz w:val="19"/>
+                <w:szCs w:val="19"/>
+              </w:rPr>
+              <w:t>: '</w:t>
+            </w:r>
+            <w:proofErr w:type="spellStart"/>
+            <w:r>
+              <w:rPr>
+                <w:color w:val="000000" w:themeColor="text1"/>
+                <w:sz w:val="19"/>
+                <w:szCs w:val="19"/>
+              </w:rPr>
+              <w:t>Universidade</w:t>
+            </w:r>
+            <w:proofErr w:type="spellEnd"/>
+            <w:r>
+              <w:rPr>
+                <w:color w:val="000000" w:themeColor="text1"/>
+                <w:sz w:val="19"/>
+                <w:szCs w:val="19"/>
+              </w:rPr>
+              <w:t xml:space="preserve"> do </w:t>
+            </w:r>
+            <w:proofErr w:type="spellStart"/>
+            <w:r>
+              <w:rPr>
+                <w:color w:val="000000" w:themeColor="text1"/>
+                <w:sz w:val="19"/>
+                <w:szCs w:val="19"/>
+              </w:rPr>
+              <w:t>Estado</w:t>
+            </w:r>
+            <w:proofErr w:type="spellEnd"/>
+            <w:r>
+              <w:rPr>
+                <w:color w:val="000000" w:themeColor="text1"/>
+                <w:sz w:val="19"/>
+                <w:szCs w:val="19"/>
+              </w:rPr>
+              <w:t xml:space="preserve"> do Rio de Janeiro' },</w:t>
+            </w:r>
+          </w:p>
+          <w:p>
+            <w:pPr>
+              <w:rPr>
+                <w:lang w:val="en-US"/>
+              </w:rPr>
+            </w:pPr>
+            <w:proofErr w:type="gramStart"/>
+            <w:r>
+              <w:rPr>
+                <w:color w:val="000000" w:themeColor="text1"/>
+                <w:sz w:val="19"/>
+                <w:szCs w:val="19"/>
+                <w:lang w:val="en-US"/>
+              </w:rPr>
+              <w:t>{ affiliation</w:t>
+            </w:r>
+            <w:proofErr w:type="gramEnd"/>
+            <w:r>
+              <w:rPr>
+                <w:color w:val="000000" w:themeColor="text1"/>
+                <w:sz w:val="19"/>
+                <w:szCs w:val="19"/>
+                <w:lang w:val="en-US"/>
+              </w:rPr>
+              <w:t>: 'East-Siberian State University' },</w:t>
+            </w:r>
+          </w:p>
+          <w:p>
+            <w:pPr>
+              <w:rPr>
+                <w:lang w:val="en-US"/>
+              </w:rPr>
+            </w:pPr>
+            <w:proofErr w:type="gramStart"/>
+            <w:r>
+              <w:rPr>
+                <w:color w:val="000000" w:themeColor="text1"/>
+                <w:sz w:val="19"/>
+                <w:szCs w:val="19"/>
+                <w:lang w:val="en-US"/>
+              </w:rPr>
+              <w:t>{ affiliation</w:t>
+            </w:r>
+            <w:proofErr w:type="gramEnd"/>
+            <w:r>
+              <w:rPr>
+                <w:color w:val="000000" w:themeColor="text1"/>
+                <w:sz w:val="19"/>
+                <w:szCs w:val="19"/>
+                <w:lang w:val="en-US"/>
+              </w:rPr>
+              <w:t xml:space="preserve">: 'Southern Polytechnic State </w:t>
+            </w:r>
+            <w:proofErr w:type="spellStart"/>
+            <w:r>
+              <w:rPr>
+                <w:color w:val="000000" w:themeColor="text1"/>
+                <w:sz w:val="19"/>
+                <w:szCs w:val="19"/>
+                <w:lang w:val="en-US"/>
+              </w:rPr>
+              <w:t>Univerisity</w:t>
+            </w:r>
+            <w:proofErr w:type="spellEnd"/>
+            <w:r>
+              <w:rPr>
+                <w:color w:val="000000" w:themeColor="text1"/>
+                <w:sz w:val="19"/>
+                <w:szCs w:val="19"/>
+                <w:lang w:val="en-US"/>
+              </w:rPr>
+              <w:t>' },</w:t>
+            </w:r>
+          </w:p>
+          <w:p>
+            <w:pPr>
+              <w:rPr>
+                <w:lang w:val="en-US"/>
+              </w:rPr>
+            </w:pPr>
+            <w:proofErr w:type="gramStart"/>
+            <w:r>
+              <w:rPr>
+                <w:color w:val="000000" w:themeColor="text1"/>
+                <w:sz w:val="19"/>
+                <w:szCs w:val="19"/>
+                <w:lang w:val="en-US"/>
+              </w:rPr>
+              <w:t>{ affiliation</w:t>
+            </w:r>
+            <w:proofErr w:type="gramEnd"/>
+            <w:r>
+              <w:rPr>
+                <w:color w:val="000000" w:themeColor="text1"/>
+                <w:sz w:val="19"/>
+                <w:szCs w:val="19"/>
+                <w:lang w:val="en-US"/>
+              </w:rPr>
+              <w:t>: 'International University of Kyrgyzstan' } ] }</w:t>
+            </w:r>
+          </w:p>
+          <w:p>
+            <w:pPr>
+              <w:rPr>
+                <w:color w:val="000000" w:themeColor="text1"/>
+                <w:sz w:val="19"/>
+                <w:szCs w:val="19"/>
+                <w:lang w:val="en-US"/>
+              </w:rPr>
+            </w:pPr>
+          </w:p>
+        </w:tc>
+      </w:tr>
+      <w:tr>
+        <w:trPr>
+          <w:trHeight w:val="300"/>
+        </w:trPr>
+        <w:tc>
+          <w:tcPr>
+            <w:tcW w:w="9630" w:type="dxa"/>
+            <w:tcBorders>
+              <w:top w:val="single" w:sz="0" w:space="0" w:color="auto"/>
+              <w:left w:val="single" w:sz="0" w:space="0" w:color="auto"/>
+              <w:bottom w:val="single" w:sz="0" w:space="0" w:color="auto"/>
+              <w:right w:val="single" w:sz="0" w:space="0" w:color="auto"/>
+            </w:tcBorders>
+          </w:tcPr>
+          <w:p>
+            <w:pPr>
+              <w:rPr>
+                <w:color w:val="000000" w:themeColor="text1"/>
+                <w:sz w:val="19"/>
+                <w:szCs w:val="19"/>
+                <w:lang w:val="en-US"/>
+              </w:rPr>
+            </w:pPr>
+          </w:p>
+        </w:tc>
+      </w:tr>
+      <w:tr>
+        <w:trPr>
+          <w:trHeight w:val="300"/>
+        </w:trPr>
+        <w:tc>
+          <w:tcPr>
+            <w:tcW w:w="9630" w:type="dxa"/>
+            <w:tcBorders>
+              <w:top w:val="single" w:sz="0" w:space="0" w:color="auto"/>
+              <w:left w:val="single" w:sz="0" w:space="0" w:color="auto"/>
+              <w:bottom w:val="single" w:sz="0" w:space="0" w:color="auto"/>
+              <w:right w:val="single" w:sz="0" w:space="0" w:color="auto"/>
+            </w:tcBorders>
+          </w:tcPr>
+          <w:p>
+            <w:pPr>
+              <w:rPr>
+                <w:color w:val="000000" w:themeColor="text1"/>
+                <w:sz w:val="19"/>
+                <w:szCs w:val="19"/>
+                <w:lang w:val="en-US"/>
+              </w:rPr>
+            </w:pPr>
+          </w:p>
+        </w:tc>
+      </w:tr>
+      <w:tr>
+        <w:trPr>
+          <w:trHeight w:val="300"/>
+        </w:trPr>
+        <w:tc>
+          <w:tcPr>
+            <w:tcW w:w="9630" w:type="dxa"/>
+            <w:tcBorders>
+              <w:top w:val="single" w:sz="0" w:space="0" w:color="auto"/>
+              <w:left w:val="single" w:sz="0" w:space="0" w:color="auto"/>
+              <w:bottom w:val="single" w:sz="0" w:space="0" w:color="auto"/>
+              <w:right w:val="single" w:sz="0" w:space="0" w:color="auto"/>
+            </w:tcBorders>
+          </w:tcPr>
+          <w:p>
+            <w:pPr>
+              <w:spacing w:line="257" w:lineRule="auto"/>
+            </w:pPr>
+            <w:r>
+              <w:rPr>
+                <w:rFonts w:ascii="Calibri" w:eastAsia="Calibri" w:hAnsi="Calibri" w:cs="Calibri"/>
+                <w:lang w:val="en-GB"/>
+              </w:rPr>
+              <w:t>4)This command deletes all the author that haven’t published anything yet</w:t>
+            </w:r>
+          </w:p>
+          <w:p>
+            <w:pPr>
+              <w:spacing w:line="257" w:lineRule="auto"/>
+            </w:pPr>
+            <w:proofErr w:type="spellStart"/>
+            <w:proofErr w:type="gramStart"/>
+            <w:r>
+              <w:rPr>
+                <w:rFonts w:ascii="Calibri" w:eastAsia="Calibri" w:hAnsi="Calibri" w:cs="Calibri"/>
+              </w:rPr>
+              <w:t>db.authors</w:t>
+            </w:r>
+            <w:proofErr w:type="gramEnd"/>
+            <w:r>
+              <w:rPr>
+                <w:rFonts w:ascii="Calibri" w:eastAsia="Calibri" w:hAnsi="Calibri" w:cs="Calibri"/>
+              </w:rPr>
+              <w:t>.deleteMany</w:t>
+            </w:r>
+            <w:proofErr w:type="spellEnd"/>
+            <w:r>
+              <w:rPr>
+                <w:rFonts w:ascii="Calibri" w:eastAsia="Calibri" w:hAnsi="Calibri" w:cs="Calibri"/>
+              </w:rPr>
+              <w:t>({‘</w:t>
+            </w:r>
+            <w:proofErr w:type="spellStart"/>
+            <w:r>
+              <w:rPr>
+                <w:rFonts w:ascii="Calibri" w:eastAsia="Calibri" w:hAnsi="Calibri" w:cs="Calibri"/>
+              </w:rPr>
+              <w:t>documents</w:t>
+            </w:r>
+            <w:proofErr w:type="spellEnd"/>
+            <w:r>
+              <w:rPr>
+                <w:rFonts w:ascii="Calibri" w:eastAsia="Calibri" w:hAnsi="Calibri" w:cs="Calibri"/>
+              </w:rPr>
+              <w:t>’:{‘$</w:t>
+            </w:r>
+            <w:proofErr w:type="spellStart"/>
+            <w:r>
+              <w:rPr>
+                <w:rFonts w:ascii="Calibri" w:eastAsia="Calibri" w:hAnsi="Calibri" w:cs="Calibri"/>
+              </w:rPr>
+              <w:t>exists</w:t>
+            </w:r>
+            <w:proofErr w:type="spellEnd"/>
+            <w:r>
+              <w:rPr>
+                <w:rFonts w:ascii="Calibri" w:eastAsia="Calibri" w:hAnsi="Calibri" w:cs="Calibri"/>
+              </w:rPr>
+              <w:t>’:</w:t>
+            </w:r>
+            <w:r>
+              <w:rPr>
+                <w:rFonts w:ascii="Calibri" w:eastAsia="Calibri" w:hAnsi="Calibri" w:cs="Calibri"/>
+              </w:rPr>
+              <w:t>false</w:t>
+            </w:r>
+            <w:r>
+              <w:rPr>
+                <w:rFonts w:ascii="Calibri" w:eastAsia="Calibri" w:hAnsi="Calibri" w:cs="Calibri"/>
+              </w:rPr>
+              <w:t>}})</w:t>
+            </w:r>
+            <w:r>
+              <w:rPr>
+                <w:rFonts w:ascii="Calibri" w:eastAsia="Calibri" w:hAnsi="Calibri" w:cs="Calibri"/>
+              </w:rPr>
+              <w:t xml:space="preserve"> //da sistemare</w:t>
+            </w:r>
+          </w:p>
+          <w:p>
+            <w:pPr>
+              <w:rPr>
+                <w:color w:val="000000" w:themeColor="text1"/>
+                <w:sz w:val="19"/>
+                <w:szCs w:val="19"/>
+              </w:rPr>
+            </w:pPr>
+          </w:p>
+        </w:tc>
+      </w:tr>
+      <w:tr>
+        <w:trPr>
+          <w:trHeight w:val="300"/>
+        </w:trPr>
+        <w:tc>
+          <w:tcPr>
+            <w:tcW w:w="9630" w:type="dxa"/>
+            <w:tcBorders>
+              <w:top w:val="single" w:sz="0" w:space="0" w:color="auto"/>
+              <w:left w:val="single" w:sz="0" w:space="0" w:color="auto"/>
+              <w:bottom w:val="single" w:sz="0" w:space="0" w:color="auto"/>
+              <w:right w:val="single" w:sz="0" w:space="0" w:color="auto"/>
+            </w:tcBorders>
+          </w:tcPr>
+          <w:p>
+            <w:pPr>
+              <w:rPr>
+                <w:color w:val="000000" w:themeColor="text1"/>
+                <w:sz w:val="19"/>
+                <w:szCs w:val="19"/>
+              </w:rPr>
+            </w:pPr>
+          </w:p>
+        </w:tc>
+      </w:tr>
+      <w:tr>
+        <w:trPr>
+          <w:trHeight w:val="300"/>
+        </w:trPr>
+        <w:tc>
+          <w:tcPr>
+            <w:tcW w:w="9630" w:type="dxa"/>
+            <w:tcBorders>
+              <w:top w:val="single" w:sz="0" w:space="0" w:color="auto"/>
+              <w:left w:val="single" w:sz="0" w:space="0" w:color="auto"/>
+              <w:bottom w:val="single" w:sz="0" w:space="0" w:color="auto"/>
+              <w:right w:val="single" w:sz="0" w:space="0" w:color="auto"/>
+            </w:tcBorders>
+          </w:tcPr>
+          <w:p>
+            <w:pPr>
+              <w:rPr>
+                <w:color w:val="000000" w:themeColor="text1"/>
+                <w:sz w:val="19"/>
+                <w:szCs w:val="19"/>
+              </w:rPr>
+            </w:pPr>
+          </w:p>
+        </w:tc>
+      </w:tr>
+      <w:tr>
+        <w:trPr>
+          <w:trHeight w:val="300"/>
+        </w:trPr>
+        <w:tc>
+          <w:tcPr>
+            <w:tcW w:w="9630" w:type="dxa"/>
+            <w:tcBorders>
+              <w:top w:val="single" w:sz="0" w:space="0" w:color="auto"/>
+              <w:left w:val="single" w:sz="0" w:space="0" w:color="auto"/>
+              <w:bottom w:val="single" w:sz="0" w:space="0" w:color="auto"/>
+              <w:right w:val="single" w:sz="0" w:space="0" w:color="auto"/>
+            </w:tcBorders>
+          </w:tcPr>
+          <w:p>
+            <w:pPr>
+              <w:rPr>
+                <w:color w:val="000000" w:themeColor="text1"/>
+                <w:sz w:val="19"/>
+                <w:szCs w:val="19"/>
+              </w:rPr>
+            </w:pPr>
+          </w:p>
+        </w:tc>
+      </w:tr>
+      <w:tr>
+        <w:trPr>
+          <w:trHeight w:val="300"/>
+        </w:trPr>
+        <w:tc>
+          <w:tcPr>
+            <w:tcW w:w="9630" w:type="dxa"/>
+            <w:tcBorders>
+              <w:top w:val="single" w:sz="0" w:space="0" w:color="auto"/>
+              <w:left w:val="single" w:sz="0" w:space="0" w:color="auto"/>
+              <w:bottom w:val="single" w:sz="0" w:space="0" w:color="auto"/>
+              <w:right w:val="single" w:sz="0" w:space="0" w:color="auto"/>
+            </w:tcBorders>
+          </w:tcPr>
+          <w:p>
+            <w:pPr>
+              <w:rPr>
+                <w:color w:val="000000" w:themeColor="text1"/>
+                <w:sz w:val="19"/>
+                <w:szCs w:val="19"/>
+              </w:rPr>
+            </w:pPr>
+          </w:p>
+        </w:tc>
+      </w:tr>
+      <w:tr>
+        <w:trPr>
+          <w:trHeight w:val="300"/>
+        </w:trPr>
+        <w:tc>
+          <w:tcPr>
+            <w:tcW w:w="9630" w:type="dxa"/>
+            <w:tcBorders>
+              <w:top w:val="single" w:sz="0" w:space="0" w:color="auto"/>
+              <w:left w:val="single" w:sz="0" w:space="0" w:color="auto"/>
+              <w:bottom w:val="single" w:sz="0" w:space="0" w:color="auto"/>
+              <w:right w:val="single" w:sz="0" w:space="0" w:color="auto"/>
+            </w:tcBorders>
+          </w:tcPr>
+          <w:p>
+            <w:pPr>
+              <w:rPr>
+                <w:color w:val="000000" w:themeColor="text1"/>
+                <w:sz w:val="19"/>
+                <w:szCs w:val="19"/>
+              </w:rPr>
+            </w:pPr>
+          </w:p>
+        </w:tc>
+      </w:tr>
+      <w:tr>
+        <w:trPr>
+          <w:trHeight w:val="300"/>
+        </w:trPr>
+        <w:tc>
+          <w:tcPr>
+            <w:tcW w:w="9630" w:type="dxa"/>
+            <w:tcBorders>
+              <w:top w:val="single" w:sz="0" w:space="0" w:color="auto"/>
+              <w:left w:val="single" w:sz="0" w:space="0" w:color="auto"/>
+              <w:bottom w:val="single" w:sz="0" w:space="0" w:color="auto"/>
+              <w:right w:val="single" w:sz="0" w:space="0" w:color="auto"/>
+            </w:tcBorders>
+          </w:tcPr>
+          <w:p>
+            <w:pPr>
+              <w:rPr>
+                <w:color w:val="000000" w:themeColor="text1"/>
+                <w:sz w:val="19"/>
+                <w:szCs w:val="19"/>
+              </w:rPr>
+            </w:pPr>
+          </w:p>
+        </w:tc>
+      </w:tr>
+      <w:tr>
+        <w:trPr>
+          <w:trHeight w:val="300"/>
+        </w:trPr>
+        <w:tc>
+          <w:tcPr>
+            <w:tcW w:w="9630" w:type="dxa"/>
+            <w:tcBorders>
+              <w:top w:val="single" w:sz="0" w:space="0" w:color="auto"/>
+              <w:left w:val="single" w:sz="0" w:space="0" w:color="auto"/>
+              <w:bottom w:val="single" w:sz="0" w:space="0" w:color="auto"/>
+              <w:right w:val="single" w:sz="0" w:space="0" w:color="auto"/>
+            </w:tcBorders>
+          </w:tcPr>
+          <w:p>
+            <w:pPr>
+              <w:rPr>
+                <w:color w:val="000000" w:themeColor="text1"/>
+                <w:sz w:val="19"/>
+                <w:szCs w:val="19"/>
+              </w:rPr>
+            </w:pPr>
+          </w:p>
+        </w:tc>
+      </w:tr>
+      <w:tr>
+        <w:trPr>
+          <w:trHeight w:val="300"/>
+        </w:trPr>
+        <w:tc>
+          <w:tcPr>
+            <w:tcW w:w="9630" w:type="dxa"/>
+            <w:tcBorders>
+              <w:top w:val="single" w:sz="0" w:space="0" w:color="auto"/>
+              <w:left w:val="single" w:sz="0" w:space="0" w:color="auto"/>
+              <w:bottom w:val="single" w:sz="0" w:space="0" w:color="auto"/>
+              <w:right w:val="single" w:sz="0" w:space="0" w:color="auto"/>
+            </w:tcBorders>
+          </w:tcPr>
+          <w:p>
+            <w:pPr>
+              <w:rPr>
+                <w:color w:val="000000" w:themeColor="text1"/>
+                <w:sz w:val="19"/>
+                <w:szCs w:val="19"/>
+              </w:rPr>
+            </w:pPr>
+          </w:p>
+        </w:tc>
+      </w:tr>
+    </w:tbl>
+    <w:p>
+      <w:pPr>
+        <w:rPr>
+          <w:rFonts w:ascii="Consolas" w:eastAsia="Consolas" w:hAnsi="Consolas" w:cs="Consolas"/>
           <w:color w:val="000000" w:themeColor="text1"/>
           <w:sz w:val="19"/>
           <w:szCs w:val="19"/>
@@ -6018,6 +7566,41 @@
         </w:rPr>
         <w:t>, Rom e Previ:</w:t>
       </w:r>
+      <w:r>
+        <w:rPr>
+          <w:rFonts w:ascii="Menlo" w:eastAsia="Menlo" w:hAnsi="Menlo" w:cs="Menlo"/>
+          <w:b/>
+          <w:bCs/>
+          <w:color w:val="000000" w:themeColor="text1"/>
+          <w:sz w:val="29"/>
+          <w:szCs w:val="29"/>
+        </w:rPr>
+        <w:t xml:space="preserve"> Non so </w:t>
+      </w:r>
+      <w:proofErr w:type="spellStart"/>
+      <w:r>
+        <w:rPr>
+          <w:rFonts w:ascii="Menlo" w:eastAsia="Menlo" w:hAnsi="Menlo" w:cs="Menlo"/>
+          <w:b/>
+          <w:bCs/>
+          <w:color w:val="000000" w:themeColor="text1"/>
+          <w:sz w:val="29"/>
+          <w:szCs w:val="29"/>
+        </w:rPr>
+        <w:t>Ric</w:t>
+      </w:r>
+      <w:proofErr w:type="spellEnd"/>
+      <w:r>
+        <w:rPr>
+          <w:rFonts w:ascii="Menlo" w:eastAsia="Menlo" w:hAnsi="Menlo" w:cs="Menlo"/>
+          <w:b/>
+          <w:bCs/>
+          <w:color w:val="000000" w:themeColor="text1"/>
+          <w:sz w:val="29"/>
+          <w:szCs w:val="29"/>
+        </w:rPr>
+        <w:t xml:space="preserve"> sembra un falso</w:t>
+      </w:r>
     </w:p>
     <w:p>
       <w:pPr>
@@ -6263,7 +7846,29 @@
           <w:szCs w:val="19"/>
           <w:lang w:val="en-US"/>
         </w:rPr>
-        <w:t xml:space="preserve"> journal are updated by adding the more general </w:t>
+        <w:t xml:space="preserve"> journal </w:t>
+      </w:r>
+      <w:proofErr w:type="gramStart"/>
+      <w:r>
+        <w:rPr>
+          <w:rFonts w:ascii="Menlo" w:eastAsia="Menlo" w:hAnsi="Menlo" w:cs="Menlo"/>
+          <w:color w:val="000000" w:themeColor="text1"/>
+          <w:sz w:val="19"/>
+          <w:szCs w:val="19"/>
+          <w:lang w:val="en-US"/>
+        </w:rPr>
+        <w:t>are</w:t>
+      </w:r>
+      <w:proofErr w:type="gramEnd"/>
+      <w:r>
+        <w:rPr>
+          <w:rFonts w:ascii="Menlo" w:eastAsia="Menlo" w:hAnsi="Menlo" w:cs="Menlo"/>
+          <w:color w:val="000000" w:themeColor="text1"/>
+          <w:sz w:val="19"/>
+          <w:szCs w:val="19"/>
+          <w:lang w:val="en-US"/>
+        </w:rPr>
+        <w:t xml:space="preserve"> updated by adding the more general </w:t>
       </w:r>
       <w:r>
         <w:rPr>
@@ -6641,11 +8246,11 @@
             <v:path o:extrusionok="f" gradientshapeok="t" o:connecttype="rect"/>
             <o:lock v:ext="edit" aspectratio="t"/>
           </v:shapetype>
-          <v:shape id="_x0000_s1026" type="#_x0000_t75" style="position:absolute;margin-left:9.85pt;margin-top:39.1pt;width:450.75pt;height:674.65pt;z-index:251659264;mso-wrap-edited:f">
+          <v:shape id="_x0000_s1028" type="#_x0000_t75" style="position:absolute;margin-left:9.85pt;margin-top:39.1pt;width:451.9pt;height:689.9pt;z-index:251658240" wrapcoords="-36 120 -36 21600 21636 21600 21636 120 -36 120">
             <v:imagedata r:id="rId5" o:title=""/>
             <w10:wrap type="tight"/>
           </v:shape>
-          <o:OLEObject Type="Embed" ProgID="Word.Document.12" ShapeID="_x0000_s1026" DrawAspect="Content" ObjectID="_1729915870" r:id="rId6">
+          <o:OLEObject Type="Embed" ProgID="Word.Document.12" ShapeID="_x0000_s1028" DrawAspect="Content" ObjectID="_1729936023" r:id="rId6">
             <o:FieldCodes>\s</o:FieldCodes>
           </o:OLEObject>
         </w:object>
@@ -6870,6 +8475,14 @@
         </w:rPr>
         <w:t>)</w:t>
       </w:r>
+      <w:r>
+        <w:rPr>
+          <w:b/>
+          <w:bCs/>
+          <w:lang w:val="en-US"/>
+        </w:rPr>
+        <w:t xml:space="preserve"> + through unwind</w:t>
+      </w:r>
     </w:p>
     <w:p>
       <w:pPr>
@@ -7031,20 +8644,8 @@
           <w:szCs w:val="19"/>
           <w:lang w:val="en-US"/>
         </w:rPr>
-        <w:t xml:space="preserve">At least 100 </w:t>
-      </w:r>
-      <w:proofErr w:type="gramStart"/>
-      <w:r>
-        <w:rPr>
-          <w:rFonts w:ascii="Menlo" w:eastAsia="Menlo" w:hAnsi="Menlo" w:cs="Menlo"/>
-          <w:color w:val="000000" w:themeColor="text1"/>
-          <w:sz w:val="19"/>
-          <w:szCs w:val="19"/>
-          <w:lang w:val="en-US"/>
-        </w:rPr>
-        <w:t>pages ???</w:t>
-      </w:r>
-      <w:proofErr w:type="gramEnd"/>
+        <w:t>At least 100 pages</w:t>
+      </w:r>
     </w:p>
     <w:p>
       <w:pPr>
@@ -7273,53 +8874,6 @@
         <w:t>3 paragraphs, at least one image un one of the paragraphs hyperlinked</w:t>
       </w:r>
     </w:p>
-    <w:p>
-      <w:pPr>
-        <w:rPr>
-          <w:rFonts w:ascii="Menlo" w:eastAsia="Menlo" w:hAnsi="Menlo" w:cs="Menlo"/>
-          <w:color w:val="000000" w:themeColor="text1"/>
-          <w:sz w:val="19"/>
-          <w:szCs w:val="19"/>
-        </w:rPr>
-      </w:pPr>
-      <w:r>
-        <w:rPr>
-          <w:rFonts w:ascii="Menlo" w:eastAsia="Menlo" w:hAnsi="Menlo" w:cs="Menlo"/>
-          <w:color w:val="000000" w:themeColor="text1"/>
-          <w:sz w:val="19"/>
-          <w:szCs w:val="19"/>
-        </w:rPr>
-        <w:t>//questione pagine?</w:t>
-      </w:r>
-    </w:p>
-    <w:p>
-      <w:pPr>
-        <w:rPr>
-          <w:rFonts w:ascii="Menlo" w:eastAsia="Menlo" w:hAnsi="Menlo" w:cs="Menlo"/>
-          <w:color w:val="000000" w:themeColor="text1"/>
-          <w:sz w:val="19"/>
-          <w:szCs w:val="19"/>
-        </w:rPr>
-      </w:pPr>
-      <w:r>
-        <w:rPr>
-          <w:rFonts w:ascii="Menlo" w:eastAsia="Menlo" w:hAnsi="Menlo" w:cs="Menlo"/>
-          <w:color w:val="000000" w:themeColor="text1"/>
-          <w:sz w:val="19"/>
-          <w:szCs w:val="19"/>
-        </w:rPr>
-        <w:t>//deve tornare I titoli… d</w:t>
-      </w:r>
-      <w:r>
-        <w:rPr>
-          <w:rFonts w:ascii="Menlo" w:eastAsia="Menlo" w:hAnsi="Menlo" w:cs="Menlo"/>
-          <w:color w:val="000000" w:themeColor="text1"/>
-          <w:sz w:val="19"/>
-          <w:szCs w:val="19"/>
-        </w:rPr>
-        <w:t>a sistemare</w:t>
-      </w:r>
-    </w:p>
     <w:bookmarkStart w:id="0" w:name="_MON_1729939488"/>
     <w:bookmarkEnd w:id="0"/>
     <w:p>
@@ -7329,6 +8883,7 @@
           <w:color w:val="000000" w:themeColor="text1"/>
           <w:sz w:val="19"/>
           <w:szCs w:val="19"/>
+          <w:lang w:val="en-US"/>
         </w:rPr>
       </w:pPr>
       <w:r>
@@ -7341,19 +8896,943 @@
           <w:highlight w:val="yellow"/>
           <w:lang w:val="en-US"/>
         </w:rPr>
-        <w:object w:dxaOrig="9638" w:dyaOrig="14201" w14:anchorId="26DE5286">
-          <v:shape id="_x0000_i1025" type="#_x0000_t75" style="width:482.4pt;height:710.05pt" o:ole="">
+        <w:object w:dxaOrig="10466" w:dyaOrig="15360" w14:anchorId="26DE5286">
+          <v:shape id="_x0000_i1025" type="#_x0000_t75" style="width:523.5pt;height:768pt" o:ole="">
             <v:imagedata r:id="rId7" o:title=""/>
           </v:shape>
-          <o:OLEObject Type="Embed" ProgID="Word.Document.12" ShapeID="_x0000_i1025" DrawAspect="Content" ObjectID="_1729915869" r:id="rId8">
+          <o:OLEObject Type="Embed" ProgID="Word.Document.12" ShapeID="_x0000_i1025" DrawAspect="Content" ObjectID="_1729936022" r:id="rId8">
             <o:FieldCodes>\s</o:FieldCodes>
           </o:OLEObject>
         </w:object>
       </w:r>
     </w:p>
+    <w:p>
+      <w:pPr>
+        <w:spacing w:after="0"/>
+        <w:rPr>
+          <w:rFonts w:ascii="Menlo" w:eastAsia="Menlo" w:hAnsi="Menlo" w:cs="Menlo"/>
+          <w:color w:val="000000" w:themeColor="text1"/>
+          <w:sz w:val="19"/>
+          <w:szCs w:val="19"/>
+          <w:lang w:val="en-US"/>
+        </w:rPr>
+      </w:pPr>
+      <w:r>
+        <w:rPr>
+          <w:rFonts w:ascii="Menlo" w:eastAsia="Menlo" w:hAnsi="Menlo" w:cs="Menlo"/>
+          <w:color w:val="000000" w:themeColor="text1"/>
+          <w:sz w:val="19"/>
+          <w:szCs w:val="19"/>
+          <w:lang w:val="en-US"/>
+        </w:rPr>
+        <w:t>[{</w:t>
+      </w:r>
+    </w:p>
+    <w:p>
+      <w:pPr>
+        <w:spacing w:after="0"/>
+        <w:rPr>
+          <w:rFonts w:ascii="Menlo" w:eastAsia="Menlo" w:hAnsi="Menlo" w:cs="Menlo"/>
+          <w:color w:val="000000" w:themeColor="text1"/>
+          <w:sz w:val="19"/>
+          <w:szCs w:val="19"/>
+          <w:lang w:val="en-US"/>
+        </w:rPr>
+      </w:pPr>
+      <w:r>
+        <w:rPr>
+          <w:rFonts w:ascii="Menlo" w:eastAsia="Menlo" w:hAnsi="Menlo" w:cs="Menlo"/>
+          <w:color w:val="000000" w:themeColor="text1"/>
+          <w:sz w:val="19"/>
+          <w:szCs w:val="19"/>
+          <w:lang w:val="en-US"/>
+        </w:rPr>
+        <w:t xml:space="preserve">  "_id": 251,</w:t>
+      </w:r>
+    </w:p>
+    <w:p>
+      <w:pPr>
+        <w:spacing w:after="0"/>
+        <w:rPr>
+          <w:rFonts w:ascii="Menlo" w:eastAsia="Menlo" w:hAnsi="Menlo" w:cs="Menlo"/>
+          <w:color w:val="000000" w:themeColor="text1"/>
+          <w:sz w:val="19"/>
+          <w:szCs w:val="19"/>
+          <w:lang w:val="en-US"/>
+        </w:rPr>
+      </w:pPr>
+      <w:r>
+        <w:rPr>
+          <w:rFonts w:ascii="Menlo" w:eastAsia="Menlo" w:hAnsi="Menlo" w:cs="Menlo"/>
+          <w:color w:val="000000" w:themeColor="text1"/>
+          <w:sz w:val="19"/>
+          <w:szCs w:val="19"/>
+          <w:lang w:val="en-US"/>
+        </w:rPr>
+        <w:t xml:space="preserve">  "</w:t>
+      </w:r>
+      <w:proofErr w:type="spellStart"/>
+      <w:proofErr w:type="gramStart"/>
+      <w:r>
+        <w:rPr>
+          <w:rFonts w:ascii="Menlo" w:eastAsia="Menlo" w:hAnsi="Menlo" w:cs="Menlo"/>
+          <w:color w:val="000000" w:themeColor="text1"/>
+          <w:sz w:val="19"/>
+          <w:szCs w:val="19"/>
+          <w:lang w:val="en-US"/>
+        </w:rPr>
+        <w:t>doc</w:t>
+      </w:r>
+      <w:proofErr w:type="gramEnd"/>
+      <w:r>
+        <w:rPr>
+          <w:rFonts w:ascii="Menlo" w:eastAsia="Menlo" w:hAnsi="Menlo" w:cs="Menlo"/>
+          <w:color w:val="000000" w:themeColor="text1"/>
+          <w:sz w:val="19"/>
+          <w:szCs w:val="19"/>
+          <w:lang w:val="en-US"/>
+        </w:rPr>
+        <w:t>_id</w:t>
+      </w:r>
+      <w:proofErr w:type="spellEnd"/>
+      <w:r>
+        <w:rPr>
+          <w:rFonts w:ascii="Menlo" w:eastAsia="Menlo" w:hAnsi="Menlo" w:cs="Menlo"/>
+          <w:color w:val="000000" w:themeColor="text1"/>
+          <w:sz w:val="19"/>
+          <w:szCs w:val="19"/>
+          <w:lang w:val="en-US"/>
+        </w:rPr>
+        <w:t>": 251,</w:t>
+      </w:r>
+    </w:p>
+    <w:p>
+      <w:pPr>
+        <w:spacing w:after="0"/>
+        <w:rPr>
+          <w:rFonts w:ascii="Menlo" w:eastAsia="Menlo" w:hAnsi="Menlo" w:cs="Menlo"/>
+          <w:color w:val="000000" w:themeColor="text1"/>
+          <w:sz w:val="19"/>
+          <w:szCs w:val="19"/>
+          <w:lang w:val="en-US"/>
+        </w:rPr>
+      </w:pPr>
+      <w:r>
+        <w:rPr>
+          <w:rFonts w:ascii="Menlo" w:eastAsia="Menlo" w:hAnsi="Menlo" w:cs="Menlo"/>
+          <w:color w:val="000000" w:themeColor="text1"/>
+          <w:sz w:val="19"/>
+          <w:szCs w:val="19"/>
+          <w:lang w:val="en-US"/>
+        </w:rPr>
+        <w:t xml:space="preserve">  "title": "Standards für das </w:t>
+      </w:r>
+      <w:proofErr w:type="spellStart"/>
+      <w:r>
+        <w:rPr>
+          <w:rFonts w:ascii="Menlo" w:eastAsia="Menlo" w:hAnsi="Menlo" w:cs="Menlo"/>
+          <w:color w:val="000000" w:themeColor="text1"/>
+          <w:sz w:val="19"/>
+          <w:szCs w:val="19"/>
+          <w:lang w:val="en-US"/>
+        </w:rPr>
+        <w:t>Programmieren</w:t>
+      </w:r>
+      <w:proofErr w:type="spellEnd"/>
+      <w:r>
+        <w:rPr>
+          <w:rFonts w:ascii="Menlo" w:eastAsia="Menlo" w:hAnsi="Menlo" w:cs="Menlo"/>
+          <w:color w:val="000000" w:themeColor="text1"/>
+          <w:sz w:val="19"/>
+          <w:szCs w:val="19"/>
+          <w:lang w:val="en-US"/>
+        </w:rPr>
+        <w:t xml:space="preserve"> in Prolog für LILOG, Version 3.3",</w:t>
+      </w:r>
+    </w:p>
+    <w:p>
+      <w:pPr>
+        <w:spacing w:after="0"/>
+        <w:rPr>
+          <w:rFonts w:ascii="Menlo" w:eastAsia="Menlo" w:hAnsi="Menlo" w:cs="Menlo"/>
+          <w:color w:val="000000" w:themeColor="text1"/>
+          <w:sz w:val="19"/>
+          <w:szCs w:val="19"/>
+          <w:lang w:val="en-US"/>
+        </w:rPr>
+      </w:pPr>
+      <w:r>
+        <w:rPr>
+          <w:rFonts w:ascii="Menlo" w:eastAsia="Menlo" w:hAnsi="Menlo" w:cs="Menlo"/>
+          <w:color w:val="000000" w:themeColor="text1"/>
+          <w:sz w:val="19"/>
+          <w:szCs w:val="19"/>
+          <w:lang w:val="en-US"/>
+        </w:rPr>
+        <w:t xml:space="preserve">  "date": "2021-06-19T05:39:43.000Z"</w:t>
+      </w:r>
+    </w:p>
+    <w:p>
+      <w:pPr>
+        <w:spacing w:after="0"/>
+        <w:rPr>
+          <w:rFonts w:ascii="Menlo" w:eastAsia="Menlo" w:hAnsi="Menlo" w:cs="Menlo"/>
+          <w:color w:val="000000" w:themeColor="text1"/>
+          <w:sz w:val="19"/>
+          <w:szCs w:val="19"/>
+          <w:lang w:val="en-US"/>
+        </w:rPr>
+      </w:pPr>
+      <w:r>
+        <w:rPr>
+          <w:rFonts w:ascii="Menlo" w:eastAsia="Menlo" w:hAnsi="Menlo" w:cs="Menlo"/>
+          <w:color w:val="000000" w:themeColor="text1"/>
+          <w:sz w:val="19"/>
+          <w:szCs w:val="19"/>
+          <w:lang w:val="en-US"/>
+        </w:rPr>
+        <w:t>},{</w:t>
+      </w:r>
+    </w:p>
+    <w:p>
+      <w:pPr>
+        <w:spacing w:after="0"/>
+        <w:rPr>
+          <w:rFonts w:ascii="Menlo" w:eastAsia="Menlo" w:hAnsi="Menlo" w:cs="Menlo"/>
+          <w:color w:val="000000" w:themeColor="text1"/>
+          <w:sz w:val="19"/>
+          <w:szCs w:val="19"/>
+          <w:lang w:val="en-US"/>
+        </w:rPr>
+      </w:pPr>
+      <w:r>
+        <w:rPr>
+          <w:rFonts w:ascii="Menlo" w:eastAsia="Menlo" w:hAnsi="Menlo" w:cs="Menlo"/>
+          <w:color w:val="000000" w:themeColor="text1"/>
+          <w:sz w:val="19"/>
+          <w:szCs w:val="19"/>
+          <w:lang w:val="en-US"/>
+        </w:rPr>
+        <w:t xml:space="preserve">  "_id": 21,</w:t>
+      </w:r>
+    </w:p>
+    <w:p>
+      <w:pPr>
+        <w:spacing w:after="0"/>
+        <w:rPr>
+          <w:rFonts w:ascii="Menlo" w:eastAsia="Menlo" w:hAnsi="Menlo" w:cs="Menlo"/>
+          <w:color w:val="000000" w:themeColor="text1"/>
+          <w:sz w:val="19"/>
+          <w:szCs w:val="19"/>
+          <w:lang w:val="en-US"/>
+        </w:rPr>
+      </w:pPr>
+      <w:r>
+        <w:rPr>
+          <w:rFonts w:ascii="Menlo" w:eastAsia="Menlo" w:hAnsi="Menlo" w:cs="Menlo"/>
+          <w:color w:val="000000" w:themeColor="text1"/>
+          <w:sz w:val="19"/>
+          <w:szCs w:val="19"/>
+          <w:lang w:val="en-US"/>
+        </w:rPr>
+        <w:t xml:space="preserve">  "</w:t>
+      </w:r>
+      <w:proofErr w:type="spellStart"/>
+      <w:proofErr w:type="gramStart"/>
+      <w:r>
+        <w:rPr>
+          <w:rFonts w:ascii="Menlo" w:eastAsia="Menlo" w:hAnsi="Menlo" w:cs="Menlo"/>
+          <w:color w:val="000000" w:themeColor="text1"/>
+          <w:sz w:val="19"/>
+          <w:szCs w:val="19"/>
+          <w:lang w:val="en-US"/>
+        </w:rPr>
+        <w:t>doc</w:t>
+      </w:r>
+      <w:proofErr w:type="gramEnd"/>
+      <w:r>
+        <w:rPr>
+          <w:rFonts w:ascii="Menlo" w:eastAsia="Menlo" w:hAnsi="Menlo" w:cs="Menlo"/>
+          <w:color w:val="000000" w:themeColor="text1"/>
+          <w:sz w:val="19"/>
+          <w:szCs w:val="19"/>
+          <w:lang w:val="en-US"/>
+        </w:rPr>
+        <w:t>_id</w:t>
+      </w:r>
+      <w:proofErr w:type="spellEnd"/>
+      <w:r>
+        <w:rPr>
+          <w:rFonts w:ascii="Menlo" w:eastAsia="Menlo" w:hAnsi="Menlo" w:cs="Menlo"/>
+          <w:color w:val="000000" w:themeColor="text1"/>
+          <w:sz w:val="19"/>
+          <w:szCs w:val="19"/>
+          <w:lang w:val="en-US"/>
+        </w:rPr>
+        <w:t>": 21,</w:t>
+      </w:r>
+    </w:p>
+    <w:p>
+      <w:pPr>
+        <w:spacing w:after="0"/>
+        <w:rPr>
+          <w:rFonts w:ascii="Menlo" w:eastAsia="Menlo" w:hAnsi="Menlo" w:cs="Menlo"/>
+          <w:color w:val="000000" w:themeColor="text1"/>
+          <w:sz w:val="19"/>
+          <w:szCs w:val="19"/>
+          <w:lang w:val="en-US"/>
+        </w:rPr>
+      </w:pPr>
+      <w:r>
+        <w:rPr>
+          <w:rFonts w:ascii="Menlo" w:eastAsia="Menlo" w:hAnsi="Menlo" w:cs="Menlo"/>
+          <w:color w:val="000000" w:themeColor="text1"/>
+          <w:sz w:val="19"/>
+          <w:szCs w:val="19"/>
+          <w:lang w:val="en-US"/>
+        </w:rPr>
+        <w:t xml:space="preserve">  "title": "Die </w:t>
+      </w:r>
+      <w:proofErr w:type="spellStart"/>
+      <w:r>
+        <w:rPr>
+          <w:rFonts w:ascii="Menlo" w:eastAsia="Menlo" w:hAnsi="Menlo" w:cs="Menlo"/>
+          <w:color w:val="000000" w:themeColor="text1"/>
+          <w:sz w:val="19"/>
+          <w:szCs w:val="19"/>
+          <w:lang w:val="en-US"/>
+        </w:rPr>
+        <w:t>Repräsentation</w:t>
+      </w:r>
+      <w:proofErr w:type="spellEnd"/>
+      <w:r>
+        <w:rPr>
+          <w:rFonts w:ascii="Menlo" w:eastAsia="Menlo" w:hAnsi="Menlo" w:cs="Menlo"/>
+          <w:color w:val="000000" w:themeColor="text1"/>
+          <w:sz w:val="19"/>
+          <w:szCs w:val="19"/>
+          <w:lang w:val="en-US"/>
+        </w:rPr>
+        <w:t xml:space="preserve"> </w:t>
+      </w:r>
+      <w:proofErr w:type="spellStart"/>
+      <w:r>
+        <w:rPr>
+          <w:rFonts w:ascii="Menlo" w:eastAsia="Menlo" w:hAnsi="Menlo" w:cs="Menlo"/>
+          <w:color w:val="000000" w:themeColor="text1"/>
+          <w:sz w:val="19"/>
+          <w:szCs w:val="19"/>
+          <w:lang w:val="en-US"/>
+        </w:rPr>
+        <w:t>räumlichen</w:t>
+      </w:r>
+      <w:proofErr w:type="spellEnd"/>
+      <w:r>
+        <w:rPr>
+          <w:rFonts w:ascii="Menlo" w:eastAsia="Menlo" w:hAnsi="Menlo" w:cs="Menlo"/>
+          <w:color w:val="000000" w:themeColor="text1"/>
+          <w:sz w:val="19"/>
+          <w:szCs w:val="19"/>
+          <w:lang w:val="en-US"/>
+        </w:rPr>
+        <w:t xml:space="preserve"> </w:t>
+      </w:r>
+      <w:proofErr w:type="spellStart"/>
+      <w:r>
+        <w:rPr>
+          <w:rFonts w:ascii="Menlo" w:eastAsia="Menlo" w:hAnsi="Menlo" w:cs="Menlo"/>
+          <w:color w:val="000000" w:themeColor="text1"/>
+          <w:sz w:val="19"/>
+          <w:szCs w:val="19"/>
+          <w:lang w:val="en-US"/>
+        </w:rPr>
+        <w:t>Wissens</w:t>
+      </w:r>
+      <w:proofErr w:type="spellEnd"/>
+      <w:r>
+        <w:rPr>
+          <w:rFonts w:ascii="Menlo" w:eastAsia="Menlo" w:hAnsi="Menlo" w:cs="Menlo"/>
+          <w:color w:val="000000" w:themeColor="text1"/>
+          <w:sz w:val="19"/>
+          <w:szCs w:val="19"/>
+          <w:lang w:val="en-US"/>
+        </w:rPr>
+        <w:t xml:space="preserve"> und die </w:t>
+      </w:r>
+      <w:proofErr w:type="spellStart"/>
+      <w:r>
+        <w:rPr>
+          <w:rFonts w:ascii="Menlo" w:eastAsia="Menlo" w:hAnsi="Menlo" w:cs="Menlo"/>
+          <w:color w:val="000000" w:themeColor="text1"/>
+          <w:sz w:val="19"/>
+          <w:szCs w:val="19"/>
+          <w:lang w:val="en-US"/>
+        </w:rPr>
+        <w:t>Behandlung</w:t>
+      </w:r>
+      <w:proofErr w:type="spellEnd"/>
+      <w:r>
+        <w:rPr>
+          <w:rFonts w:ascii="Menlo" w:eastAsia="Menlo" w:hAnsi="Menlo" w:cs="Menlo"/>
+          <w:color w:val="000000" w:themeColor="text1"/>
+          <w:sz w:val="19"/>
+          <w:szCs w:val="19"/>
+          <w:lang w:val="en-US"/>
+        </w:rPr>
+        <w:t xml:space="preserve"> von </w:t>
+      </w:r>
+      <w:proofErr w:type="spellStart"/>
+      <w:r>
+        <w:rPr>
+          <w:rFonts w:ascii="Menlo" w:eastAsia="Menlo" w:hAnsi="Menlo" w:cs="Menlo"/>
+          <w:color w:val="000000" w:themeColor="text1"/>
+          <w:sz w:val="19"/>
+          <w:szCs w:val="19"/>
+          <w:lang w:val="en-US"/>
+        </w:rPr>
+        <w:t>Einbettungsproblemen</w:t>
+      </w:r>
+      <w:proofErr w:type="spellEnd"/>
+      <w:r>
+        <w:rPr>
+          <w:rFonts w:ascii="Menlo" w:eastAsia="Menlo" w:hAnsi="Menlo" w:cs="Menlo"/>
+          <w:color w:val="000000" w:themeColor="text1"/>
+          <w:sz w:val="19"/>
+          <w:szCs w:val="19"/>
+          <w:lang w:val="en-US"/>
+        </w:rPr>
+        <w:t xml:space="preserve"> </w:t>
+      </w:r>
+      <w:proofErr w:type="spellStart"/>
+      <w:r>
+        <w:rPr>
+          <w:rFonts w:ascii="Menlo" w:eastAsia="Menlo" w:hAnsi="Menlo" w:cs="Menlo"/>
+          <w:color w:val="000000" w:themeColor="text1"/>
+          <w:sz w:val="19"/>
+          <w:szCs w:val="19"/>
+          <w:lang w:val="en-US"/>
+        </w:rPr>
+        <w:t>mit</w:t>
+      </w:r>
+      <w:proofErr w:type="spellEnd"/>
+      <w:r>
+        <w:rPr>
+          <w:rFonts w:ascii="Menlo" w:eastAsia="Menlo" w:hAnsi="Menlo" w:cs="Menlo"/>
+          <w:color w:val="000000" w:themeColor="text1"/>
+          <w:sz w:val="19"/>
+          <w:szCs w:val="19"/>
+          <w:lang w:val="en-US"/>
+        </w:rPr>
+        <w:t xml:space="preserve"> </w:t>
+      </w:r>
+      <w:proofErr w:type="spellStart"/>
+      <w:r>
+        <w:rPr>
+          <w:rFonts w:ascii="Menlo" w:eastAsia="Menlo" w:hAnsi="Menlo" w:cs="Menlo"/>
+          <w:color w:val="000000" w:themeColor="text1"/>
+          <w:sz w:val="19"/>
+          <w:szCs w:val="19"/>
+          <w:lang w:val="en-US"/>
+        </w:rPr>
+        <w:t>Quadtreedepiktionen</w:t>
+      </w:r>
+      <w:proofErr w:type="spellEnd"/>
+      <w:r>
+        <w:rPr>
+          <w:rFonts w:ascii="Menlo" w:eastAsia="Menlo" w:hAnsi="Menlo" w:cs="Menlo"/>
+          <w:color w:val="000000" w:themeColor="text1"/>
+          <w:sz w:val="19"/>
+          <w:szCs w:val="19"/>
+          <w:lang w:val="en-US"/>
+        </w:rPr>
+        <w:t>",</w:t>
+      </w:r>
+    </w:p>
+    <w:p>
+      <w:pPr>
+        <w:spacing w:after="0"/>
+        <w:rPr>
+          <w:rFonts w:ascii="Menlo" w:eastAsia="Menlo" w:hAnsi="Menlo" w:cs="Menlo"/>
+          <w:color w:val="000000" w:themeColor="text1"/>
+          <w:sz w:val="19"/>
+          <w:szCs w:val="19"/>
+          <w:lang w:val="en-US"/>
+        </w:rPr>
+      </w:pPr>
+      <w:r>
+        <w:rPr>
+          <w:rFonts w:ascii="Menlo" w:eastAsia="Menlo" w:hAnsi="Menlo" w:cs="Menlo"/>
+          <w:color w:val="000000" w:themeColor="text1"/>
+          <w:sz w:val="19"/>
+          <w:szCs w:val="19"/>
+          <w:lang w:val="en-US"/>
+        </w:rPr>
+        <w:t xml:space="preserve">  "date": "2020-01-16T03:01:44.000Z"</w:t>
+      </w:r>
+    </w:p>
+    <w:p>
+      <w:pPr>
+        <w:spacing w:after="0"/>
+        <w:rPr>
+          <w:rFonts w:ascii="Menlo" w:eastAsia="Menlo" w:hAnsi="Menlo" w:cs="Menlo"/>
+          <w:color w:val="000000" w:themeColor="text1"/>
+          <w:sz w:val="19"/>
+          <w:szCs w:val="19"/>
+          <w:lang w:val="en-US"/>
+        </w:rPr>
+      </w:pPr>
+      <w:r>
+        <w:rPr>
+          <w:rFonts w:ascii="Menlo" w:eastAsia="Menlo" w:hAnsi="Menlo" w:cs="Menlo"/>
+          <w:color w:val="000000" w:themeColor="text1"/>
+          <w:sz w:val="19"/>
+          <w:szCs w:val="19"/>
+          <w:lang w:val="en-US"/>
+        </w:rPr>
+        <w:t>},{</w:t>
+      </w:r>
+    </w:p>
+    <w:p>
+      <w:pPr>
+        <w:spacing w:after="0"/>
+        <w:rPr>
+          <w:rFonts w:ascii="Menlo" w:eastAsia="Menlo" w:hAnsi="Menlo" w:cs="Menlo"/>
+          <w:color w:val="000000" w:themeColor="text1"/>
+          <w:sz w:val="19"/>
+          <w:szCs w:val="19"/>
+          <w:lang w:val="en-US"/>
+        </w:rPr>
+      </w:pPr>
+      <w:r>
+        <w:rPr>
+          <w:rFonts w:ascii="Menlo" w:eastAsia="Menlo" w:hAnsi="Menlo" w:cs="Menlo"/>
+          <w:color w:val="000000" w:themeColor="text1"/>
+          <w:sz w:val="19"/>
+          <w:szCs w:val="19"/>
+          <w:lang w:val="en-US"/>
+        </w:rPr>
+        <w:t xml:space="preserve">  "_id": 254,</w:t>
+      </w:r>
+    </w:p>
+    <w:p>
+      <w:pPr>
+        <w:spacing w:after="0"/>
+        <w:rPr>
+          <w:rFonts w:ascii="Menlo" w:eastAsia="Menlo" w:hAnsi="Menlo" w:cs="Menlo"/>
+          <w:color w:val="000000" w:themeColor="text1"/>
+          <w:sz w:val="19"/>
+          <w:szCs w:val="19"/>
+          <w:lang w:val="en-US"/>
+        </w:rPr>
+      </w:pPr>
+      <w:r>
+        <w:rPr>
+          <w:rFonts w:ascii="Menlo" w:eastAsia="Menlo" w:hAnsi="Menlo" w:cs="Menlo"/>
+          <w:color w:val="000000" w:themeColor="text1"/>
+          <w:sz w:val="19"/>
+          <w:szCs w:val="19"/>
+          <w:lang w:val="en-US"/>
+        </w:rPr>
+        <w:t xml:space="preserve">  "</w:t>
+      </w:r>
+      <w:proofErr w:type="spellStart"/>
+      <w:proofErr w:type="gramStart"/>
+      <w:r>
+        <w:rPr>
+          <w:rFonts w:ascii="Menlo" w:eastAsia="Menlo" w:hAnsi="Menlo" w:cs="Menlo"/>
+          <w:color w:val="000000" w:themeColor="text1"/>
+          <w:sz w:val="19"/>
+          <w:szCs w:val="19"/>
+          <w:lang w:val="en-US"/>
+        </w:rPr>
+        <w:t>doc</w:t>
+      </w:r>
+      <w:proofErr w:type="gramEnd"/>
+      <w:r>
+        <w:rPr>
+          <w:rFonts w:ascii="Menlo" w:eastAsia="Menlo" w:hAnsi="Menlo" w:cs="Menlo"/>
+          <w:color w:val="000000" w:themeColor="text1"/>
+          <w:sz w:val="19"/>
+          <w:szCs w:val="19"/>
+          <w:lang w:val="en-US"/>
+        </w:rPr>
+        <w:t>_id</w:t>
+      </w:r>
+      <w:proofErr w:type="spellEnd"/>
+      <w:r>
+        <w:rPr>
+          <w:rFonts w:ascii="Menlo" w:eastAsia="Menlo" w:hAnsi="Menlo" w:cs="Menlo"/>
+          <w:color w:val="000000" w:themeColor="text1"/>
+          <w:sz w:val="19"/>
+          <w:szCs w:val="19"/>
+          <w:lang w:val="en-US"/>
+        </w:rPr>
+        <w:t>": 254,</w:t>
+      </w:r>
+    </w:p>
+    <w:p>
+      <w:pPr>
+        <w:spacing w:after="0"/>
+        <w:rPr>
+          <w:rFonts w:ascii="Menlo" w:eastAsia="Menlo" w:hAnsi="Menlo" w:cs="Menlo"/>
+          <w:color w:val="000000" w:themeColor="text1"/>
+          <w:sz w:val="19"/>
+          <w:szCs w:val="19"/>
+          <w:lang w:val="en-US"/>
+        </w:rPr>
+      </w:pPr>
+      <w:r>
+        <w:rPr>
+          <w:rFonts w:ascii="Menlo" w:eastAsia="Menlo" w:hAnsi="Menlo" w:cs="Menlo"/>
+          <w:color w:val="000000" w:themeColor="text1"/>
+          <w:sz w:val="19"/>
+          <w:szCs w:val="19"/>
+          <w:lang w:val="en-US"/>
+        </w:rPr>
+        <w:t xml:space="preserve">  "title": "Using a Structured English Query Language as a Data Definition Facility.",</w:t>
+      </w:r>
+    </w:p>
+    <w:p>
+      <w:pPr>
+        <w:spacing w:after="0"/>
+        <w:rPr>
+          <w:rFonts w:ascii="Menlo" w:eastAsia="Menlo" w:hAnsi="Menlo" w:cs="Menlo"/>
+          <w:color w:val="000000" w:themeColor="text1"/>
+          <w:sz w:val="19"/>
+          <w:szCs w:val="19"/>
+          <w:lang w:val="en-US"/>
+        </w:rPr>
+      </w:pPr>
+      <w:r>
+        <w:rPr>
+          <w:rFonts w:ascii="Menlo" w:eastAsia="Menlo" w:hAnsi="Menlo" w:cs="Menlo"/>
+          <w:color w:val="000000" w:themeColor="text1"/>
+          <w:sz w:val="19"/>
+          <w:szCs w:val="19"/>
+          <w:lang w:val="en-US"/>
+        </w:rPr>
+        <w:t xml:space="preserve">  "date": "2019-08-27T21:23:26.000Z"</w:t>
+      </w:r>
+    </w:p>
+    <w:p>
+      <w:pPr>
+        <w:spacing w:after="0"/>
+        <w:rPr>
+          <w:rFonts w:ascii="Menlo" w:eastAsia="Menlo" w:hAnsi="Menlo" w:cs="Menlo"/>
+          <w:color w:val="000000" w:themeColor="text1"/>
+          <w:sz w:val="19"/>
+          <w:szCs w:val="19"/>
+          <w:lang w:val="en-US"/>
+        </w:rPr>
+      </w:pPr>
+      <w:r>
+        <w:rPr>
+          <w:rFonts w:ascii="Menlo" w:eastAsia="Menlo" w:hAnsi="Menlo" w:cs="Menlo"/>
+          <w:color w:val="000000" w:themeColor="text1"/>
+          <w:sz w:val="19"/>
+          <w:szCs w:val="19"/>
+          <w:lang w:val="en-US"/>
+        </w:rPr>
+        <w:t>},{</w:t>
+      </w:r>
+    </w:p>
+    <w:p>
+      <w:pPr>
+        <w:spacing w:after="0"/>
+        <w:rPr>
+          <w:rFonts w:ascii="Menlo" w:eastAsia="Menlo" w:hAnsi="Menlo" w:cs="Menlo"/>
+          <w:color w:val="000000" w:themeColor="text1"/>
+          <w:sz w:val="19"/>
+          <w:szCs w:val="19"/>
+          <w:lang w:val="en-US"/>
+        </w:rPr>
+      </w:pPr>
+      <w:r>
+        <w:rPr>
+          <w:rFonts w:ascii="Menlo" w:eastAsia="Menlo" w:hAnsi="Menlo" w:cs="Menlo"/>
+          <w:color w:val="000000" w:themeColor="text1"/>
+          <w:sz w:val="19"/>
+          <w:szCs w:val="19"/>
+          <w:lang w:val="en-US"/>
+        </w:rPr>
+        <w:t xml:space="preserve">  "_id": 489,</w:t>
+      </w:r>
+    </w:p>
+    <w:p>
+      <w:pPr>
+        <w:spacing w:after="0"/>
+        <w:rPr>
+          <w:rFonts w:ascii="Menlo" w:eastAsia="Menlo" w:hAnsi="Menlo" w:cs="Menlo"/>
+          <w:color w:val="000000" w:themeColor="text1"/>
+          <w:sz w:val="19"/>
+          <w:szCs w:val="19"/>
+          <w:lang w:val="en-US"/>
+        </w:rPr>
+      </w:pPr>
+      <w:r>
+        <w:rPr>
+          <w:rFonts w:ascii="Menlo" w:eastAsia="Menlo" w:hAnsi="Menlo" w:cs="Menlo"/>
+          <w:color w:val="000000" w:themeColor="text1"/>
+          <w:sz w:val="19"/>
+          <w:szCs w:val="19"/>
+          <w:lang w:val="en-US"/>
+        </w:rPr>
+        <w:t xml:space="preserve">  "</w:t>
+      </w:r>
+      <w:proofErr w:type="spellStart"/>
+      <w:proofErr w:type="gramStart"/>
+      <w:r>
+        <w:rPr>
+          <w:rFonts w:ascii="Menlo" w:eastAsia="Menlo" w:hAnsi="Menlo" w:cs="Menlo"/>
+          <w:color w:val="000000" w:themeColor="text1"/>
+          <w:sz w:val="19"/>
+          <w:szCs w:val="19"/>
+          <w:lang w:val="en-US"/>
+        </w:rPr>
+        <w:t>doc</w:t>
+      </w:r>
+      <w:proofErr w:type="gramEnd"/>
+      <w:r>
+        <w:rPr>
+          <w:rFonts w:ascii="Menlo" w:eastAsia="Menlo" w:hAnsi="Menlo" w:cs="Menlo"/>
+          <w:color w:val="000000" w:themeColor="text1"/>
+          <w:sz w:val="19"/>
+          <w:szCs w:val="19"/>
+          <w:lang w:val="en-US"/>
+        </w:rPr>
+        <w:t>_id</w:t>
+      </w:r>
+      <w:proofErr w:type="spellEnd"/>
+      <w:r>
+        <w:rPr>
+          <w:rFonts w:ascii="Menlo" w:eastAsia="Menlo" w:hAnsi="Menlo" w:cs="Menlo"/>
+          <w:color w:val="000000" w:themeColor="text1"/>
+          <w:sz w:val="19"/>
+          <w:szCs w:val="19"/>
+          <w:lang w:val="en-US"/>
+        </w:rPr>
+        <w:t>": 489,</w:t>
+      </w:r>
+    </w:p>
+    <w:p>
+      <w:pPr>
+        <w:spacing w:after="0"/>
+        <w:rPr>
+          <w:rFonts w:ascii="Menlo" w:eastAsia="Menlo" w:hAnsi="Menlo" w:cs="Menlo"/>
+          <w:color w:val="000000" w:themeColor="text1"/>
+          <w:sz w:val="19"/>
+          <w:szCs w:val="19"/>
+          <w:lang w:val="en-US"/>
+        </w:rPr>
+      </w:pPr>
+      <w:r>
+        <w:rPr>
+          <w:rFonts w:ascii="Menlo" w:eastAsia="Menlo" w:hAnsi="Menlo" w:cs="Menlo"/>
+          <w:color w:val="000000" w:themeColor="text1"/>
+          <w:sz w:val="19"/>
+          <w:szCs w:val="19"/>
+          <w:lang w:val="en-US"/>
+        </w:rPr>
+        <w:t xml:space="preserve">  "title": "On the Expressiveness of Tree Set Operators",</w:t>
+      </w:r>
+    </w:p>
+    <w:p>
+      <w:pPr>
+        <w:spacing w:after="0"/>
+        <w:rPr>
+          <w:rFonts w:ascii="Menlo" w:eastAsia="Menlo" w:hAnsi="Menlo" w:cs="Menlo"/>
+          <w:color w:val="000000" w:themeColor="text1"/>
+          <w:sz w:val="19"/>
+          <w:szCs w:val="19"/>
+          <w:lang w:val="en-US"/>
+        </w:rPr>
+      </w:pPr>
+      <w:r>
+        <w:rPr>
+          <w:rFonts w:ascii="Menlo" w:eastAsia="Menlo" w:hAnsi="Menlo" w:cs="Menlo"/>
+          <w:color w:val="000000" w:themeColor="text1"/>
+          <w:sz w:val="19"/>
+          <w:szCs w:val="19"/>
+          <w:lang w:val="en-US"/>
+        </w:rPr>
+        <w:t xml:space="preserve">  "date": "2019-06-08T00:52:34.000Z"</w:t>
+      </w:r>
+    </w:p>
+    <w:p>
+      <w:pPr>
+        <w:spacing w:after="0"/>
+        <w:rPr>
+          <w:rFonts w:ascii="Menlo" w:eastAsia="Menlo" w:hAnsi="Menlo" w:cs="Menlo"/>
+          <w:color w:val="000000" w:themeColor="text1"/>
+          <w:sz w:val="19"/>
+          <w:szCs w:val="19"/>
+          <w:lang w:val="en-US"/>
+        </w:rPr>
+      </w:pPr>
+      <w:r>
+        <w:rPr>
+          <w:rFonts w:ascii="Menlo" w:eastAsia="Menlo" w:hAnsi="Menlo" w:cs="Menlo"/>
+          <w:color w:val="000000" w:themeColor="text1"/>
+          <w:sz w:val="19"/>
+          <w:szCs w:val="19"/>
+          <w:lang w:val="en-US"/>
+        </w:rPr>
+        <w:t>},{</w:t>
+      </w:r>
+    </w:p>
+    <w:p>
+      <w:pPr>
+        <w:spacing w:after="0"/>
+        <w:rPr>
+          <w:rFonts w:ascii="Menlo" w:eastAsia="Menlo" w:hAnsi="Menlo" w:cs="Menlo"/>
+          <w:color w:val="000000" w:themeColor="text1"/>
+          <w:sz w:val="19"/>
+          <w:szCs w:val="19"/>
+          <w:lang w:val="en-US"/>
+        </w:rPr>
+      </w:pPr>
+      <w:r>
+        <w:rPr>
+          <w:rFonts w:ascii="Menlo" w:eastAsia="Menlo" w:hAnsi="Menlo" w:cs="Menlo"/>
+          <w:color w:val="000000" w:themeColor="text1"/>
+          <w:sz w:val="19"/>
+          <w:szCs w:val="19"/>
+          <w:lang w:val="en-US"/>
+        </w:rPr>
+        <w:t xml:space="preserve">  "_id": 179,</w:t>
+      </w:r>
+    </w:p>
+    <w:p>
+      <w:pPr>
+        <w:spacing w:after="0"/>
+        <w:rPr>
+          <w:rFonts w:ascii="Menlo" w:eastAsia="Menlo" w:hAnsi="Menlo" w:cs="Menlo"/>
+          <w:color w:val="000000" w:themeColor="text1"/>
+          <w:sz w:val="19"/>
+          <w:szCs w:val="19"/>
+          <w:lang w:val="en-US"/>
+        </w:rPr>
+      </w:pPr>
+      <w:r>
+        <w:rPr>
+          <w:rFonts w:ascii="Menlo" w:eastAsia="Menlo" w:hAnsi="Menlo" w:cs="Menlo"/>
+          <w:color w:val="000000" w:themeColor="text1"/>
+          <w:sz w:val="19"/>
+          <w:szCs w:val="19"/>
+          <w:lang w:val="en-US"/>
+        </w:rPr>
+        <w:t xml:space="preserve">  "</w:t>
+      </w:r>
+      <w:proofErr w:type="spellStart"/>
+      <w:proofErr w:type="gramStart"/>
+      <w:r>
+        <w:rPr>
+          <w:rFonts w:ascii="Menlo" w:eastAsia="Menlo" w:hAnsi="Menlo" w:cs="Menlo"/>
+          <w:color w:val="000000" w:themeColor="text1"/>
+          <w:sz w:val="19"/>
+          <w:szCs w:val="19"/>
+          <w:lang w:val="en-US"/>
+        </w:rPr>
+        <w:t>doc</w:t>
+      </w:r>
+      <w:proofErr w:type="gramEnd"/>
+      <w:r>
+        <w:rPr>
+          <w:rFonts w:ascii="Menlo" w:eastAsia="Menlo" w:hAnsi="Menlo" w:cs="Menlo"/>
+          <w:color w:val="000000" w:themeColor="text1"/>
+          <w:sz w:val="19"/>
+          <w:szCs w:val="19"/>
+          <w:lang w:val="en-US"/>
+        </w:rPr>
+        <w:t>_id</w:t>
+      </w:r>
+      <w:proofErr w:type="spellEnd"/>
+      <w:r>
+        <w:rPr>
+          <w:rFonts w:ascii="Menlo" w:eastAsia="Menlo" w:hAnsi="Menlo" w:cs="Menlo"/>
+          <w:color w:val="000000" w:themeColor="text1"/>
+          <w:sz w:val="19"/>
+          <w:szCs w:val="19"/>
+          <w:lang w:val="en-US"/>
+        </w:rPr>
+        <w:t>": 179,</w:t>
+      </w:r>
+    </w:p>
+    <w:p>
+      <w:pPr>
+        <w:spacing w:after="0"/>
+        <w:rPr>
+          <w:rFonts w:ascii="Menlo" w:eastAsia="Menlo" w:hAnsi="Menlo" w:cs="Menlo"/>
+          <w:color w:val="000000" w:themeColor="text1"/>
+          <w:sz w:val="19"/>
+          <w:szCs w:val="19"/>
+          <w:lang w:val="en-US"/>
+        </w:rPr>
+      </w:pPr>
+      <w:r>
+        <w:rPr>
+          <w:rFonts w:ascii="Menlo" w:eastAsia="Menlo" w:hAnsi="Menlo" w:cs="Menlo"/>
+          <w:color w:val="000000" w:themeColor="text1"/>
+          <w:sz w:val="19"/>
+          <w:szCs w:val="19"/>
+          <w:lang w:val="en-US"/>
+        </w:rPr>
+        <w:t xml:space="preserve">  "title": "EFTA Query Processing in LILOG-DB",</w:t>
+      </w:r>
+    </w:p>
+    <w:p>
+      <w:pPr>
+        <w:spacing w:after="0"/>
+        <w:rPr>
+          <w:rFonts w:ascii="Menlo" w:eastAsia="Menlo" w:hAnsi="Menlo" w:cs="Menlo"/>
+          <w:color w:val="000000" w:themeColor="text1"/>
+          <w:sz w:val="19"/>
+          <w:szCs w:val="19"/>
+        </w:rPr>
+      </w:pPr>
+      <w:r>
+        <w:rPr>
+          <w:rFonts w:ascii="Menlo" w:eastAsia="Menlo" w:hAnsi="Menlo" w:cs="Menlo"/>
+          <w:color w:val="000000" w:themeColor="text1"/>
+          <w:sz w:val="19"/>
+          <w:szCs w:val="19"/>
+          <w:lang w:val="en-US"/>
+        </w:rPr>
+        <w:t xml:space="preserve">  </w:t>
+      </w:r>
+      <w:r>
+        <w:rPr>
+          <w:rFonts w:ascii="Menlo" w:eastAsia="Menlo" w:hAnsi="Menlo" w:cs="Menlo"/>
+          <w:color w:val="000000" w:themeColor="text1"/>
+          <w:sz w:val="19"/>
+          <w:szCs w:val="19"/>
+        </w:rPr>
+        <w:t>"date": "2019-05-22T17:21:23.000Z"</w:t>
+      </w:r>
+    </w:p>
+    <w:p>
+      <w:pPr>
+        <w:spacing w:after="0"/>
+        <w:rPr>
+          <w:rFonts w:ascii="Menlo" w:eastAsia="Menlo" w:hAnsi="Menlo" w:cs="Menlo"/>
+          <w:color w:val="000000" w:themeColor="text1"/>
+          <w:sz w:val="19"/>
+          <w:szCs w:val="19"/>
+        </w:rPr>
+      </w:pPr>
+      <w:r>
+        <w:rPr>
+          <w:rFonts w:ascii="Menlo" w:eastAsia="Menlo" w:hAnsi="Menlo" w:cs="Menlo"/>
+          <w:color w:val="000000" w:themeColor="text1"/>
+          <w:sz w:val="19"/>
+          <w:szCs w:val="19"/>
+        </w:rPr>
+        <w:t>}]</w:t>
+      </w:r>
+    </w:p>
     <w:sectPr>
       <w:pgSz w:w="11906" w:h="16838"/>
-      <w:pgMar w:top="1417" w:right="1134" w:bottom="1134" w:left="1134" w:header="708" w:footer="708" w:gutter="0"/>
+      <w:pgMar w:top="720" w:right="720" w:bottom="720" w:left="720" w:header="708" w:footer="708" w:gutter="0"/>
       <w:cols w:space="708"/>
       <w:docGrid w:linePitch="360"/>
     </w:sectPr>
@@ -7675,6 +10154,119 @@
     </w:lvl>
   </w:abstractNum>
   <w:abstractNum w:abstractNumId="3" w15:restartNumberingAfterBreak="0">
+    <w:nsid w:val="407C93E6"/>
+    <w:multiLevelType w:val="hybridMultilevel"/>
+    <w:tmpl w:val="0082EF5A"/>
+    <w:lvl w:ilvl="0" w:tplc="EC44A982">
+      <w:start w:val="1"/>
+      <w:numFmt w:val="bullet"/>
+      <w:lvlText w:val="·"/>
+      <w:lvlJc w:val="left"/>
+      <w:pPr>
+        <w:ind w:left="720" w:hanging="360"/>
+      </w:pPr>
+      <w:rPr>
+        <w:rFonts w:ascii="Symbol" w:hAnsi="Symbol" w:hint="default"/>
+      </w:rPr>
+    </w:lvl>
+    <w:lvl w:ilvl="1" w:tplc="4EAEC474">
+      <w:start w:val="1"/>
+      <w:numFmt w:val="bullet"/>
+      <w:lvlText w:val="o"/>
+      <w:lvlJc w:val="left"/>
+      <w:pPr>
+        <w:ind w:left="1440" w:hanging="360"/>
+      </w:pPr>
+      <w:rPr>
+        <w:rFonts w:ascii="Courier New" w:hAnsi="Courier New" w:hint="default"/>
+      </w:rPr>
+    </w:lvl>
+    <w:lvl w:ilvl="2" w:tplc="396AFF7C">
+      <w:start w:val="1"/>
+      <w:numFmt w:val="bullet"/>
+      <w:lvlText w:val=""/>
+      <w:lvlJc w:val="left"/>
+      <w:pPr>
+        <w:ind w:left="2160" w:hanging="360"/>
+      </w:pPr>
+      <w:rPr>
+        <w:rFonts w:ascii="Wingdings" w:hAnsi="Wingdings" w:hint="default"/>
+      </w:rPr>
+    </w:lvl>
+    <w:lvl w:ilvl="3" w:tplc="DC0655EA">
+      <w:start w:val="1"/>
+      <w:numFmt w:val="bullet"/>
+      <w:lvlText w:val=""/>
+      <w:lvlJc w:val="left"/>
+      <w:pPr>
+        <w:ind w:left="2880" w:hanging="360"/>
+      </w:pPr>
+      <w:rPr>
+        <w:rFonts w:ascii="Symbol" w:hAnsi="Symbol" w:hint="default"/>
+      </w:rPr>
+    </w:lvl>
+    <w:lvl w:ilvl="4" w:tplc="8598781A">
+      <w:start w:val="1"/>
+      <w:numFmt w:val="bullet"/>
+      <w:lvlText w:val="o"/>
+      <w:lvlJc w:val="left"/>
+      <w:pPr>
+        <w:ind w:left="3600" w:hanging="360"/>
+      </w:pPr>
+      <w:rPr>
+        <w:rFonts w:ascii="Courier New" w:hAnsi="Courier New" w:hint="default"/>
+      </w:rPr>
+    </w:lvl>
+    <w:lvl w:ilvl="5" w:tplc="0CC40CC2">
+      <w:start w:val="1"/>
+      <w:numFmt w:val="bullet"/>
+      <w:lvlText w:val=""/>
+      <w:lvlJc w:val="left"/>
+      <w:pPr>
+        <w:ind w:left="4320" w:hanging="360"/>
+      </w:pPr>
+      <w:rPr>
+        <w:rFonts w:ascii="Wingdings" w:hAnsi="Wingdings" w:hint="default"/>
+      </w:rPr>
+    </w:lvl>
+    <w:lvl w:ilvl="6" w:tplc="D4CE8C6C">
+      <w:start w:val="1"/>
+      <w:numFmt w:val="bullet"/>
+      <w:lvlText w:val=""/>
+      <w:lvlJc w:val="left"/>
+      <w:pPr>
+        <w:ind w:left="5040" w:hanging="360"/>
+      </w:pPr>
+      <w:rPr>
+        <w:rFonts w:ascii="Symbol" w:hAnsi="Symbol" w:hint="default"/>
+      </w:rPr>
+    </w:lvl>
+    <w:lvl w:ilvl="7" w:tplc="76B8D6D2">
+      <w:start w:val="1"/>
+      <w:numFmt w:val="bullet"/>
+      <w:lvlText w:val="o"/>
+      <w:lvlJc w:val="left"/>
+      <w:pPr>
+        <w:ind w:left="5760" w:hanging="360"/>
+      </w:pPr>
+      <w:rPr>
+        <w:rFonts w:ascii="Courier New" w:hAnsi="Courier New" w:hint="default"/>
+      </w:rPr>
+    </w:lvl>
+    <w:lvl w:ilvl="8" w:tplc="F73AFF66">
+      <w:start w:val="1"/>
+      <w:numFmt w:val="bullet"/>
+      <w:lvlText w:val=""/>
+      <w:lvlJc w:val="left"/>
+      <w:pPr>
+        <w:ind w:left="6480" w:hanging="360"/>
+      </w:pPr>
+      <w:rPr>
+        <w:rFonts w:ascii="Wingdings" w:hAnsi="Wingdings" w:hint="default"/>
+      </w:rPr>
+    </w:lvl>
+  </w:abstractNum>
+  <w:abstractNum w:abstractNumId="4" w15:restartNumberingAfterBreak="0">
     <w:nsid w:val="466C5105"/>
     <w:multiLevelType w:val="hybridMultilevel"/>
     <w:tmpl w:val="C5D2B152"/>
@@ -7763,7 +10355,7 @@
       </w:pPr>
     </w:lvl>
   </w:abstractNum>
-  <w:abstractNum w:abstractNumId="4" w15:restartNumberingAfterBreak="0">
+  <w:abstractNum w:abstractNumId="5" w15:restartNumberingAfterBreak="0">
     <w:nsid w:val="60931134"/>
     <w:multiLevelType w:val="hybridMultilevel"/>
     <w:tmpl w:val="AAA64A12"/>
@@ -7849,7 +10441,7 @@
       </w:pPr>
     </w:lvl>
   </w:abstractNum>
-  <w:abstractNum w:abstractNumId="5" w15:restartNumberingAfterBreak="0">
+  <w:abstractNum w:abstractNumId="6" w15:restartNumberingAfterBreak="0">
     <w:nsid w:val="76EC0A44"/>
     <w:multiLevelType w:val="hybridMultilevel"/>
     <w:tmpl w:val="78B2E8A0"/>
@@ -7971,12 +10563,15 @@
     <w:abstractNumId w:val="0"/>
   </w:num>
   <w:num w:numId="4" w16cid:durableId="1188640738">
+    <w:abstractNumId w:val="5"/>
+  </w:num>
+  <w:num w:numId="5" w16cid:durableId="101921839">
+    <w:abstractNumId w:val="6"/>
+  </w:num>
+  <w:num w:numId="6" w16cid:durableId="510923340">
     <w:abstractNumId w:val="4"/>
   </w:num>
-  <w:num w:numId="5" w16cid:durableId="101921839">
-    <w:abstractNumId w:val="5"/>
-  </w:num>
-  <w:num w:numId="6" w16cid:durableId="510923340">
+  <w:num w:numId="7" w16cid:durableId="577327415">
     <w:abstractNumId w:val="3"/>
   </w:num>
 </w:numbering>

</xml_diff>